<commit_message>
26-07-26, Deliberatieve democratie bijgewerkt
</commit_message>
<xml_diff>
--- a/BlogsWord/Deliberatievedemocratie.docx
+++ b/BlogsWord/Deliberatievedemocratie.docx
@@ -1337,132 +1337,29 @@
           <w:sz w:val="22"/>
           <w:szCs w:val="22"/>
         </w:rPr>
-        <w:t xml:space="preserve">Dat idee van opbouwen van democratie is niet altijd eenvoudig en succesvol, maar </w:t>
-      </w:r>
-      <w:r>
-        <w:rPr>
-          <w:rFonts w:ascii="Courier New" w:hAnsi="Courier New" w:cs="Courier New"/>
-          <w:sz w:val="22"/>
-          <w:szCs w:val="22"/>
-        </w:rPr>
-        <w:t>dit soort</w:t>
-      </w:r>
-      <w:r>
-        <w:rPr>
-          <w:rFonts w:ascii="Courier New" w:hAnsi="Courier New" w:cs="Courier New"/>
-          <w:sz w:val="22"/>
-          <w:szCs w:val="22"/>
-        </w:rPr>
-        <w:t xml:space="preserve"> initiatieven om met elkaar problemen op te lossen door</w:t>
-      </w:r>
-      <w:r>
-        <w:rPr>
-          <w:rFonts w:ascii="Courier New" w:hAnsi="Courier New" w:cs="Courier New"/>
-          <w:sz w:val="22"/>
-          <w:szCs w:val="22"/>
-        </w:rPr>
-        <w:t xml:space="preserve"> vertegenwoordigende groepen die naar het algemeen belang kijken </w:t>
-      </w:r>
-      <w:r>
-        <w:rPr>
-          <w:rFonts w:ascii="Courier New" w:hAnsi="Courier New" w:cs="Courier New"/>
-          <w:sz w:val="22"/>
-          <w:szCs w:val="22"/>
-        </w:rPr>
-        <w:t xml:space="preserve">zijn er </w:t>
-      </w:r>
-      <w:r>
-        <w:rPr>
-          <w:rFonts w:ascii="Courier New" w:hAnsi="Courier New" w:cs="Courier New"/>
-          <w:sz w:val="22"/>
-          <w:szCs w:val="22"/>
-        </w:rPr>
-        <w:t>wereldwijd steeds vaker</w:t>
-      </w:r>
-      <w:r>
-        <w:rPr>
-          <w:rFonts w:ascii="Courier New" w:hAnsi="Courier New" w:cs="Courier New"/>
-          <w:sz w:val="22"/>
-          <w:szCs w:val="22"/>
-        </w:rPr>
-        <w:t>. In Frankrijk, Oostenrijk, Polen, Singapore, Wales, Schotland, Canada en België zijn er voorbeelden hiervan. Sinds 2019 zijn er meer dan negenhonderd va</w:t>
-      </w:r>
-      <w:r>
-        <w:rPr>
-          <w:rFonts w:ascii="Courier New" w:hAnsi="Courier New" w:cs="Courier New"/>
-          <w:sz w:val="22"/>
-          <w:szCs w:val="22"/>
-        </w:rPr>
-        <w:t>n</w:t>
-      </w:r>
-      <w:r>
-        <w:rPr>
-          <w:rFonts w:ascii="Courier New" w:hAnsi="Courier New" w:cs="Courier New"/>
-          <w:sz w:val="22"/>
-          <w:szCs w:val="22"/>
-        </w:rPr>
-        <w:t xml:space="preserve"> deze volksvertegenwoordigingen geweest in ten minste veertig landen</w:t>
-      </w:r>
-      <w:r>
-        <w:rPr>
-          <w:rFonts w:ascii="Courier New" w:hAnsi="Courier New" w:cs="Courier New"/>
-          <w:sz w:val="22"/>
-          <w:szCs w:val="22"/>
-        </w:rPr>
-        <w:t xml:space="preserve"> en d</w:t>
-      </w:r>
-      <w:r>
-        <w:rPr>
-          <w:rFonts w:ascii="Courier New" w:hAnsi="Courier New" w:cs="Courier New"/>
-          <w:sz w:val="22"/>
-          <w:szCs w:val="22"/>
-        </w:rPr>
-        <w:t xml:space="preserve">at </w:t>
-      </w:r>
-      <w:r>
-        <w:rPr>
-          <w:rFonts w:ascii="Courier New" w:hAnsi="Courier New" w:cs="Courier New"/>
-          <w:sz w:val="22"/>
-          <w:szCs w:val="22"/>
-        </w:rPr>
-        <w:t>aantal bereidt steeds verder uit. Het succes hangt van voorwaarden af, zoals hoe zijn de burgers geselecteerd, wie vertegenwoordigen ze, hoe worden ze geïnformeerd</w:t>
-      </w:r>
-      <w:r>
-        <w:rPr>
-          <w:rFonts w:ascii="Courier New" w:hAnsi="Courier New" w:cs="Courier New"/>
-          <w:sz w:val="22"/>
-          <w:szCs w:val="22"/>
-        </w:rPr>
-        <w:t xml:space="preserve"> en</w:t>
-      </w:r>
-      <w:r>
-        <w:rPr>
-          <w:rFonts w:ascii="Courier New" w:hAnsi="Courier New" w:cs="Courier New"/>
-          <w:sz w:val="22"/>
-          <w:szCs w:val="22"/>
-        </w:rPr>
-        <w:t xml:space="preserve"> wat leren ze</w:t>
-      </w:r>
-      <w:r>
-        <w:rPr>
-          <w:rFonts w:ascii="Courier New" w:hAnsi="Courier New" w:cs="Courier New"/>
-          <w:sz w:val="22"/>
-          <w:szCs w:val="22"/>
-        </w:rPr>
-        <w:t xml:space="preserve">, </w:t>
-      </w:r>
-      <w:r>
-        <w:rPr>
-          <w:rFonts w:ascii="Courier New" w:hAnsi="Courier New" w:cs="Courier New"/>
-          <w:sz w:val="22"/>
-          <w:szCs w:val="22"/>
-        </w:rPr>
-        <w:t xml:space="preserve">hoe worden ze gefaciliteerd, hoe gebruiken ze hun kennis, hoe nemen ze beslissingen en wat wordt er met die beslissingen gedaan. </w:t>
+        <w:t xml:space="preserve">Een steeds belangrijker onderdeel van publieke opinie in een vertegenwoordigende democratie is de peiling geworden waarmee de mening van de burger op een eenvoudige manier gemeten wordt. De beperking daarvan wordt steeds meer ingezien. Het ondermijnt democratie steeds meer en het wordt een gereedschap om afwijkende meningen te onderdrukken en de verschillen tussen groepen uit te buiten. In de democratieën van tegenwoordig loopt de vrije pers ook </w:t>
+      </w:r>
+      <w:r>
+        <w:rPr>
+          <w:rFonts w:ascii="Courier New" w:hAnsi="Courier New" w:cs="Courier New"/>
+          <w:sz w:val="22"/>
+          <w:szCs w:val="22"/>
+        </w:rPr>
+        <w:t xml:space="preserve">steeds meer </w:t>
+      </w:r>
+      <w:r>
+        <w:rPr>
+          <w:rFonts w:ascii="Courier New" w:hAnsi="Courier New" w:cs="Courier New"/>
+          <w:sz w:val="22"/>
+          <w:szCs w:val="22"/>
+        </w:rPr>
+        <w:t xml:space="preserve">gevaar omdat de nieuwsgaring in handen is van een kleine groep hele rijke mensen en bedrijven die niet veel op hebben met het algemeen belang. En de manier waarop jongeren via sociale media worden benaderd. </w:t>
       </w:r>
     </w:p>
     <w:p>
       <w:pPr>
         <w:spacing w:line="360" w:lineRule="auto"/>
+        <w:ind w:firstLine="720"/>
         <w:rPr>
           <w:rFonts w:ascii="Courier New" w:hAnsi="Courier New" w:cs="Courier New"/>
           <w:sz w:val="22"/>
@@ -1475,48 +1372,225 @@
           <w:sz w:val="22"/>
           <w:szCs w:val="22"/>
         </w:rPr>
+        <w:t>Daarom is het goed dat er naar nieuwe manieren wordt gezocht om met burgers om te gaan. He</w:t>
+      </w:r>
+      <w:r>
+        <w:rPr>
+          <w:rFonts w:ascii="Courier New" w:hAnsi="Courier New" w:cs="Courier New"/>
+          <w:sz w:val="22"/>
+          <w:szCs w:val="22"/>
+        </w:rPr>
+        <w:t xml:space="preserve">t idee van </w:t>
+      </w:r>
+      <w:r>
+        <w:rPr>
+          <w:rFonts w:ascii="Courier New" w:hAnsi="Courier New" w:cs="Courier New"/>
+          <w:sz w:val="22"/>
+          <w:szCs w:val="22"/>
+        </w:rPr>
+        <w:t xml:space="preserve">deliberatieve </w:t>
+      </w:r>
+      <w:r>
+        <w:rPr>
+          <w:rFonts w:ascii="Courier New" w:hAnsi="Courier New" w:cs="Courier New"/>
+          <w:sz w:val="22"/>
+          <w:szCs w:val="22"/>
+        </w:rPr>
+        <w:t xml:space="preserve">democratie is </w:t>
+      </w:r>
+      <w:r>
+        <w:rPr>
+          <w:rFonts w:ascii="Courier New" w:hAnsi="Courier New" w:cs="Courier New"/>
+          <w:sz w:val="22"/>
+          <w:szCs w:val="22"/>
+        </w:rPr>
+        <w:t xml:space="preserve">daarbij </w:t>
+      </w:r>
+      <w:r>
+        <w:rPr>
+          <w:rFonts w:ascii="Courier New" w:hAnsi="Courier New" w:cs="Courier New"/>
+          <w:sz w:val="22"/>
+          <w:szCs w:val="22"/>
+        </w:rPr>
+        <w:t xml:space="preserve">niet altijd eenvoudig en succesvol, maar </w:t>
+      </w:r>
+      <w:r>
+        <w:rPr>
+          <w:rFonts w:ascii="Courier New" w:hAnsi="Courier New" w:cs="Courier New"/>
+          <w:sz w:val="22"/>
+          <w:szCs w:val="22"/>
+        </w:rPr>
+        <w:t>dit soort</w:t>
+      </w:r>
+      <w:r>
+        <w:rPr>
+          <w:rFonts w:ascii="Courier New" w:hAnsi="Courier New" w:cs="Courier New"/>
+          <w:sz w:val="22"/>
+          <w:szCs w:val="22"/>
+        </w:rPr>
+        <w:t xml:space="preserve"> initiatieven om met elkaar problemen op te lossen door</w:t>
+      </w:r>
+      <w:r>
+        <w:rPr>
+          <w:rFonts w:ascii="Courier New" w:hAnsi="Courier New" w:cs="Courier New"/>
+          <w:sz w:val="22"/>
+          <w:szCs w:val="22"/>
+        </w:rPr>
+        <w:t xml:space="preserve"> vertegenwoordigende groepen die naar het algemeen belang kijken </w:t>
+      </w:r>
+      <w:r>
+        <w:rPr>
+          <w:rFonts w:ascii="Courier New" w:hAnsi="Courier New" w:cs="Courier New"/>
+          <w:sz w:val="22"/>
+          <w:szCs w:val="22"/>
+        </w:rPr>
+        <w:t xml:space="preserve">zijn er </w:t>
+      </w:r>
+      <w:r>
+        <w:rPr>
+          <w:rFonts w:ascii="Courier New" w:hAnsi="Courier New" w:cs="Courier New"/>
+          <w:sz w:val="22"/>
+          <w:szCs w:val="22"/>
+        </w:rPr>
+        <w:t xml:space="preserve">wereldwijd </w:t>
+      </w:r>
+      <w:r>
+        <w:rPr>
+          <w:rFonts w:ascii="Courier New" w:hAnsi="Courier New" w:cs="Courier New"/>
+          <w:sz w:val="22"/>
+          <w:szCs w:val="22"/>
+        </w:rPr>
+        <w:t xml:space="preserve">wel </w:t>
+      </w:r>
+      <w:r>
+        <w:rPr>
+          <w:rFonts w:ascii="Courier New" w:hAnsi="Courier New" w:cs="Courier New"/>
+          <w:sz w:val="22"/>
+          <w:szCs w:val="22"/>
+        </w:rPr>
+        <w:t>steeds vaker</w:t>
+      </w:r>
+      <w:r>
+        <w:rPr>
+          <w:rFonts w:ascii="Courier New" w:hAnsi="Courier New" w:cs="Courier New"/>
+          <w:sz w:val="22"/>
+          <w:szCs w:val="22"/>
+        </w:rPr>
+        <w:t>. In Frankrijk, Oostenrijk, Polen, Singapore, Wales, Schotland, Canada en België zijn er voorbeelden hiervan. Sinds 2019 zijn er meer dan negenhonderd va</w:t>
+      </w:r>
+      <w:r>
+        <w:rPr>
+          <w:rFonts w:ascii="Courier New" w:hAnsi="Courier New" w:cs="Courier New"/>
+          <w:sz w:val="22"/>
+          <w:szCs w:val="22"/>
+        </w:rPr>
+        <w:t>n</w:t>
+      </w:r>
+      <w:r>
+        <w:rPr>
+          <w:rFonts w:ascii="Courier New" w:hAnsi="Courier New" w:cs="Courier New"/>
+          <w:sz w:val="22"/>
+          <w:szCs w:val="22"/>
+        </w:rPr>
+        <w:t xml:space="preserve"> deze volksvertegenwoordigingen geweest in ten minste veertig landen</w:t>
+      </w:r>
+      <w:r>
+        <w:rPr>
+          <w:rFonts w:ascii="Courier New" w:hAnsi="Courier New" w:cs="Courier New"/>
+          <w:sz w:val="22"/>
+          <w:szCs w:val="22"/>
+        </w:rPr>
+        <w:t>. He</w:t>
+      </w:r>
+      <w:r>
+        <w:rPr>
+          <w:rFonts w:ascii="Courier New" w:hAnsi="Courier New" w:cs="Courier New"/>
+          <w:sz w:val="22"/>
+          <w:szCs w:val="22"/>
+        </w:rPr>
+        <w:t xml:space="preserve">t </w:t>
+      </w:r>
+      <w:r>
+        <w:rPr>
+          <w:rFonts w:ascii="Courier New" w:hAnsi="Courier New" w:cs="Courier New"/>
+          <w:sz w:val="22"/>
+          <w:szCs w:val="22"/>
+        </w:rPr>
+        <w:t>aantal bereidt steeds verder uit. Het succes hangt van voorwaarden af, zoals hoe zijn de burgers geselecteerd, wie vertegenwoordigen ze, hoe worden ze geïnformeerd</w:t>
+      </w:r>
+      <w:r>
+        <w:rPr>
+          <w:rFonts w:ascii="Courier New" w:hAnsi="Courier New" w:cs="Courier New"/>
+          <w:sz w:val="22"/>
+          <w:szCs w:val="22"/>
+        </w:rPr>
+        <w:t xml:space="preserve"> en</w:t>
+      </w:r>
+      <w:r>
+        <w:rPr>
+          <w:rFonts w:ascii="Courier New" w:hAnsi="Courier New" w:cs="Courier New"/>
+          <w:sz w:val="22"/>
+          <w:szCs w:val="22"/>
+        </w:rPr>
+        <w:t xml:space="preserve"> wat leren ze</w:t>
+      </w:r>
+      <w:r>
+        <w:rPr>
+          <w:rFonts w:ascii="Courier New" w:hAnsi="Courier New" w:cs="Courier New"/>
+          <w:sz w:val="22"/>
+          <w:szCs w:val="22"/>
+        </w:rPr>
+        <w:t xml:space="preserve">, </w:t>
+      </w:r>
+      <w:r>
+        <w:rPr>
+          <w:rFonts w:ascii="Courier New" w:hAnsi="Courier New" w:cs="Courier New"/>
+          <w:sz w:val="22"/>
+          <w:szCs w:val="22"/>
+        </w:rPr>
+        <w:t xml:space="preserve">hoe worden ze gefaciliteerd, hoe gebruiken ze hun kennis, hoe nemen ze beslissingen en wat wordt er met die beslissingen gedaan. </w:t>
+      </w:r>
+    </w:p>
+    <w:p>
+      <w:pPr>
+        <w:spacing w:line="360" w:lineRule="auto"/>
+        <w:rPr>
+          <w:rFonts w:ascii="Courier New" w:hAnsi="Courier New" w:cs="Courier New"/>
+          <w:sz w:val="22"/>
+          <w:szCs w:val="22"/>
+        </w:rPr>
+      </w:pPr>
+      <w:r>
+        <w:rPr>
+          <w:rFonts w:ascii="Courier New" w:hAnsi="Courier New" w:cs="Courier New"/>
+          <w:sz w:val="22"/>
+          <w:szCs w:val="22"/>
+        </w:rPr>
         <w:tab/>
-        <w:t>Een steeds belangrijker onderdeel van publieke opinie in een vertegenwoordigende democratie is de peiling geworden</w:t>
-      </w:r>
-      <w:r>
-        <w:rPr>
-          <w:rFonts w:ascii="Courier New" w:hAnsi="Courier New" w:cs="Courier New"/>
-          <w:sz w:val="22"/>
-          <w:szCs w:val="22"/>
-        </w:rPr>
-        <w:t xml:space="preserve"> waarmee de mening van de burger op een eenvoudige manier gemeten wordt. De beperking daarvan wordt steeds meer ingezien. Het ondermijnt democratie steeds meer en het wordt een gereedschap om afwijkende meningen te onderdrukken en de verschillen tussen groepen uit te buiten. Het is beter om als overheden te zoeken naar hoe van mensen kan worden geleerd en het publiek </w:t>
-      </w:r>
-      <w:r>
-        <w:rPr>
-          <w:rFonts w:ascii="Courier New" w:hAnsi="Courier New" w:cs="Courier New"/>
-          <w:sz w:val="22"/>
-          <w:szCs w:val="22"/>
-        </w:rPr>
-        <w:t xml:space="preserve">is </w:t>
-      </w:r>
-      <w:r>
-        <w:rPr>
-          <w:rFonts w:ascii="Courier New" w:hAnsi="Courier New" w:cs="Courier New"/>
-          <w:sz w:val="22"/>
-          <w:szCs w:val="22"/>
-        </w:rPr>
-        <w:t xml:space="preserve">te betrekken dan </w:t>
-      </w:r>
-      <w:r>
-        <w:rPr>
-          <w:rFonts w:ascii="Courier New" w:hAnsi="Courier New" w:cs="Courier New"/>
-          <w:sz w:val="22"/>
-          <w:szCs w:val="22"/>
-        </w:rPr>
-        <w:t>steeds maar weer de opbrengsten van</w:t>
-      </w:r>
-      <w:r>
-        <w:rPr>
-          <w:rFonts w:ascii="Courier New" w:hAnsi="Courier New" w:cs="Courier New"/>
-          <w:sz w:val="22"/>
-          <w:szCs w:val="22"/>
-        </w:rPr>
-        <w:t xml:space="preserve"> eenvoudige peilingen te volgen. MacLeod en Johnson gaan op zoek naar initiatieven die hierbij passen, zoals het digitale platform vTaiwan en Polis d</w:t>
+      </w:r>
+      <w:r>
+        <w:rPr>
+          <w:rFonts w:ascii="Courier New" w:hAnsi="Courier New" w:cs="Courier New"/>
+          <w:sz w:val="22"/>
+          <w:szCs w:val="22"/>
+        </w:rPr>
+        <w:t>MacLeod en Johnson gaan op zoek naar initiatieven die hierbij passen</w:t>
+      </w:r>
+      <w:r>
+        <w:rPr>
+          <w:rFonts w:ascii="Courier New" w:hAnsi="Courier New" w:cs="Courier New"/>
+          <w:sz w:val="22"/>
+          <w:szCs w:val="22"/>
+        </w:rPr>
+        <w:t xml:space="preserve">. Zo is er het </w:t>
+      </w:r>
+      <w:r>
+        <w:rPr>
+          <w:rFonts w:ascii="Courier New" w:hAnsi="Courier New" w:cs="Courier New"/>
+          <w:sz w:val="22"/>
+          <w:szCs w:val="22"/>
+        </w:rPr>
+        <w:t>digitale platform vTaiwan en Polis d</w:t>
       </w:r>
       <w:r>
         <w:rPr>
@@ -1532,7 +1606,39 @@
           <w:sz w:val="22"/>
           <w:szCs w:val="22"/>
         </w:rPr>
-        <w:t xml:space="preserve"> zorgt voor menselijke dialoog en gezamenlijke beslissing en </w:t>
+        <w:t xml:space="preserve"> zorgt voor menselijke dialoog</w:t>
+      </w:r>
+      <w:r>
+        <w:rPr>
+          <w:rFonts w:ascii="Courier New" w:hAnsi="Courier New" w:cs="Courier New"/>
+          <w:sz w:val="22"/>
+          <w:szCs w:val="22"/>
+        </w:rPr>
+        <w:t xml:space="preserve">, </w:t>
+      </w:r>
+      <w:r>
+        <w:rPr>
+          <w:rFonts w:ascii="Courier New" w:hAnsi="Courier New" w:cs="Courier New"/>
+          <w:sz w:val="22"/>
+          <w:szCs w:val="22"/>
+        </w:rPr>
+        <w:t>gezamenlijk beslissing</w:t>
+      </w:r>
+      <w:r>
+        <w:rPr>
+          <w:rFonts w:ascii="Courier New" w:hAnsi="Courier New" w:cs="Courier New"/>
+          <w:sz w:val="22"/>
+          <w:szCs w:val="22"/>
+        </w:rPr>
+        <w:t>en nemen</w:t>
+      </w:r>
+      <w:r>
+        <w:rPr>
+          <w:rFonts w:ascii="Courier New" w:hAnsi="Courier New" w:cs="Courier New"/>
+          <w:sz w:val="22"/>
+          <w:szCs w:val="22"/>
+        </w:rPr>
+        <w:t xml:space="preserve"> en </w:t>
       </w:r>
       <w:r>
         <w:rPr>
@@ -1556,7 +1662,23 @@
           <w:sz w:val="22"/>
           <w:szCs w:val="22"/>
         </w:rPr>
-        <w:t xml:space="preserve"> veel </w:t>
+        <w:t xml:space="preserve"> </w:t>
+      </w:r>
+      <w:r>
+        <w:rPr>
+          <w:rFonts w:ascii="Courier New" w:hAnsi="Courier New" w:cs="Courier New"/>
+          <w:sz w:val="22"/>
+          <w:szCs w:val="22"/>
+        </w:rPr>
+        <w:t xml:space="preserve">ook </w:t>
+      </w:r>
+      <w:r>
+        <w:rPr>
+          <w:rFonts w:ascii="Courier New" w:hAnsi="Courier New" w:cs="Courier New"/>
+          <w:sz w:val="22"/>
+          <w:szCs w:val="22"/>
+        </w:rPr>
+        <w:t xml:space="preserve">veel </w:t>
       </w:r>
       <w:r>
         <w:rPr>
@@ -1588,31 +1710,7 @@
           <w:sz w:val="22"/>
           <w:szCs w:val="22"/>
         </w:rPr>
-        <w:t xml:space="preserve"> Rosling (Zweden), Suzuki (Canada) en Nye (Amerika) en </w:t>
-      </w:r>
-      <w:r>
-        <w:rPr>
-          <w:rFonts w:ascii="Courier New" w:hAnsi="Courier New" w:cs="Courier New"/>
-          <w:sz w:val="22"/>
-          <w:szCs w:val="22"/>
-        </w:rPr>
-        <w:t>bij hen gaat</w:t>
-      </w:r>
-      <w:r>
-        <w:rPr>
-          <w:rFonts w:ascii="Courier New" w:hAnsi="Courier New" w:cs="Courier New"/>
-          <w:sz w:val="22"/>
-          <w:szCs w:val="22"/>
-        </w:rPr>
-        <w:t xml:space="preserve"> het om de </w:t>
-      </w:r>
-      <w:r>
-        <w:rPr>
-          <w:rFonts w:ascii="Courier New" w:hAnsi="Courier New" w:cs="Courier New"/>
-          <w:sz w:val="22"/>
-          <w:szCs w:val="22"/>
-        </w:rPr>
-        <w:t xml:space="preserve">liefde van kennis en het respect voor het publiek dat zij uitstralen. In de democratieën van tegenwoordig loopt de vrije pers ook gevaar omdat de nieuwsgaring in </w:t>
+        <w:t xml:space="preserve"> Rosling </w:t>
       </w:r>
       <w:r>
         <w:rPr>
@@ -1621,31 +1719,439 @@
           <w:szCs w:val="22"/>
         </w:rPr>
         <w:lastRenderedPageBreak/>
-        <w:t>handen is van een kleine groep hele rijke mensen en bedrijven die niet veel op hebben met het algemeen belang. En de manier waarop jongeren via sociale media worden benaderd. Daarvoor is het belangrijk om de monopolie van deze groepen te doorbreken, te investeren in publieke ruimtes (zeker met lokaal nieuws) en gebruikers te beschermen zoals dat voor andere infrastructuren heel normaal is. Een goed functionerende democratie is geen luxe.</w:t>
-      </w:r>
-      <w:r>
-        <w:rPr>
-          <w:rFonts w:ascii="Courier New" w:hAnsi="Courier New" w:cs="Courier New"/>
-          <w:sz w:val="22"/>
-          <w:szCs w:val="22"/>
-        </w:rPr>
-        <w:t xml:space="preserve"> Democratie heeft een betere communicatie nodig tussen overheid, experts en burgers, waarbij meer van burgers geleerd moet worden en zij ook meer vertrouwen krijgen. De burgers kunnen hier zelf initiatief toe nemen, zoals in het voorbeeld van grote hoeveelheden kindertanden verzamelen om met elkaar de invloed van oefeningen met nucleaire wapens aan te tonen; de burgerinitiatieven in Canada om met elkaaer Syrische vluchtelingen op te vangen; het ‘stolperstein’-project in Duitsland om zichtbaar te maken waar Joden woonden voordat de Nazis kwamen. Ook </w:t>
-      </w:r>
-      <w:r>
-        <w:rPr>
-          <w:rFonts w:ascii="Courier New" w:hAnsi="Courier New" w:cs="Courier New"/>
-          <w:sz w:val="22"/>
-          <w:szCs w:val="22"/>
-        </w:rPr>
-        <w:t>kunnen er associaties gevormd worden om met elkaar te leren, betrokken te zijn te zijn en algemeen belang en binding uit te drukken, zoals de jaarlijkse Folkemødet in Denemarken, het land van de associaties, als meerdaags democratiefestival voor duizenden mensen; de duizenden ‘People’s Association’ in Singaporte; en Community of Businesses-coöperatie in Ann Arbor; het kunnen ook kleinere gemeenschapsinitiatieven zijn zoals de Community Conferencing Center in Baltimore incidenten, criminaliteit en conflicten met elkaar op te lossen</w:t>
-      </w:r>
-      <w:r>
-        <w:rPr>
-          <w:rFonts w:ascii="Courier New" w:hAnsi="Courier New" w:cs="Courier New"/>
-          <w:sz w:val="22"/>
-          <w:szCs w:val="22"/>
-        </w:rPr>
-        <w:t>; of het Frontier College dat in Nova Scotia begon om immigranten te helpen bij hun integratie</w:t>
+        <w:t>(Zweden), Suzuki (Canada) en Nye (Amerika)</w:t>
+      </w:r>
+      <w:r>
+        <w:rPr>
+          <w:rFonts w:ascii="Courier New" w:hAnsi="Courier New" w:cs="Courier New"/>
+          <w:sz w:val="22"/>
+          <w:szCs w:val="22"/>
+        </w:rPr>
+        <w:t>, wetenschappers waarbij het</w:t>
+      </w:r>
+      <w:r>
+        <w:rPr>
+          <w:rFonts w:ascii="Courier New" w:hAnsi="Courier New" w:cs="Courier New"/>
+          <w:sz w:val="22"/>
+          <w:szCs w:val="22"/>
+        </w:rPr>
+        <w:t xml:space="preserve"> gaat</w:t>
+      </w:r>
+      <w:r>
+        <w:rPr>
+          <w:rFonts w:ascii="Courier New" w:hAnsi="Courier New" w:cs="Courier New"/>
+          <w:sz w:val="22"/>
+          <w:szCs w:val="22"/>
+        </w:rPr>
+        <w:t xml:space="preserve"> om de </w:t>
+      </w:r>
+      <w:r>
+        <w:rPr>
+          <w:rFonts w:ascii="Courier New" w:hAnsi="Courier New" w:cs="Courier New"/>
+          <w:sz w:val="22"/>
+          <w:szCs w:val="22"/>
+        </w:rPr>
+        <w:t xml:space="preserve">liefde van kennis en </w:t>
+      </w:r>
+      <w:r>
+        <w:rPr>
+          <w:rFonts w:ascii="Courier New" w:hAnsi="Courier New" w:cs="Courier New"/>
+          <w:sz w:val="22"/>
+          <w:szCs w:val="22"/>
+        </w:rPr>
+        <w:t>die</w:t>
+      </w:r>
+      <w:r>
+        <w:rPr>
+          <w:rFonts w:ascii="Courier New" w:hAnsi="Courier New" w:cs="Courier New"/>
+          <w:sz w:val="22"/>
+          <w:szCs w:val="22"/>
+        </w:rPr>
+        <w:t xml:space="preserve"> respect voor het publiek uitstralen. </w:t>
+      </w:r>
+      <w:r>
+        <w:rPr>
+          <w:rFonts w:ascii="Courier New" w:hAnsi="Courier New" w:cs="Courier New"/>
+          <w:sz w:val="22"/>
+          <w:szCs w:val="22"/>
+        </w:rPr>
+        <w:t xml:space="preserve">Voor deliberatieve democratie </w:t>
+      </w:r>
+      <w:r>
+        <w:rPr>
+          <w:rFonts w:ascii="Courier New" w:hAnsi="Courier New" w:cs="Courier New"/>
+          <w:sz w:val="22"/>
+          <w:szCs w:val="22"/>
+        </w:rPr>
+        <w:t xml:space="preserve">is het belangrijk </w:t>
+      </w:r>
+      <w:r>
+        <w:rPr>
+          <w:rFonts w:ascii="Courier New" w:hAnsi="Courier New" w:cs="Courier New"/>
+          <w:sz w:val="22"/>
+          <w:szCs w:val="22"/>
+        </w:rPr>
+        <w:t>als</w:t>
+      </w:r>
+      <w:r>
+        <w:rPr>
+          <w:rFonts w:ascii="Courier New" w:hAnsi="Courier New" w:cs="Courier New"/>
+          <w:sz w:val="22"/>
+          <w:szCs w:val="22"/>
+        </w:rPr>
+        <w:t xml:space="preserve"> de monopolie van </w:t>
+      </w:r>
+      <w:r>
+        <w:rPr>
+          <w:rFonts w:ascii="Courier New" w:hAnsi="Courier New" w:cs="Courier New"/>
+          <w:sz w:val="22"/>
+          <w:szCs w:val="22"/>
+        </w:rPr>
+        <w:t xml:space="preserve">een kleine selecte groep op de media wordt </w:t>
+      </w:r>
+      <w:r>
+        <w:rPr>
+          <w:rFonts w:ascii="Courier New" w:hAnsi="Courier New" w:cs="Courier New"/>
+          <w:sz w:val="22"/>
+          <w:szCs w:val="22"/>
+        </w:rPr>
+        <w:t>doorbr</w:t>
+      </w:r>
+      <w:r>
+        <w:rPr>
+          <w:rFonts w:ascii="Courier New" w:hAnsi="Courier New" w:cs="Courier New"/>
+          <w:sz w:val="22"/>
+          <w:szCs w:val="22"/>
+        </w:rPr>
+        <w:t>o</w:t>
+      </w:r>
+      <w:r>
+        <w:rPr>
+          <w:rFonts w:ascii="Courier New" w:hAnsi="Courier New" w:cs="Courier New"/>
+          <w:sz w:val="22"/>
+          <w:szCs w:val="22"/>
+        </w:rPr>
+        <w:t xml:space="preserve">ken, </w:t>
+      </w:r>
+      <w:r>
+        <w:rPr>
+          <w:rFonts w:ascii="Courier New" w:hAnsi="Courier New" w:cs="Courier New"/>
+          <w:sz w:val="22"/>
+          <w:szCs w:val="22"/>
+        </w:rPr>
+        <w:t>als er wordt geïnvesteerd</w:t>
+      </w:r>
+      <w:r>
+        <w:rPr>
+          <w:rFonts w:ascii="Courier New" w:hAnsi="Courier New" w:cs="Courier New"/>
+          <w:sz w:val="22"/>
+          <w:szCs w:val="22"/>
+        </w:rPr>
+        <w:t xml:space="preserve"> in publieke ruimtes (zeker met lokaal nieuws) en gebruikers </w:t>
+      </w:r>
+      <w:r>
+        <w:rPr>
+          <w:rFonts w:ascii="Courier New" w:hAnsi="Courier New" w:cs="Courier New"/>
+          <w:sz w:val="22"/>
+          <w:szCs w:val="22"/>
+        </w:rPr>
+        <w:t>worden</w:t>
+      </w:r>
+      <w:r>
+        <w:rPr>
+          <w:rFonts w:ascii="Courier New" w:hAnsi="Courier New" w:cs="Courier New"/>
+          <w:sz w:val="22"/>
+          <w:szCs w:val="22"/>
+        </w:rPr>
+        <w:t xml:space="preserve"> bescherm</w:t>
+      </w:r>
+      <w:r>
+        <w:rPr>
+          <w:rFonts w:ascii="Courier New" w:hAnsi="Courier New" w:cs="Courier New"/>
+          <w:sz w:val="22"/>
+          <w:szCs w:val="22"/>
+        </w:rPr>
+        <w:t>d,</w:t>
+      </w:r>
+      <w:r>
+        <w:rPr>
+          <w:rFonts w:ascii="Courier New" w:hAnsi="Courier New" w:cs="Courier New"/>
+          <w:sz w:val="22"/>
+          <w:szCs w:val="22"/>
+        </w:rPr>
+        <w:t xml:space="preserve"> zoals dat </w:t>
+      </w:r>
+      <w:r>
+        <w:rPr>
+          <w:rFonts w:ascii="Courier New" w:hAnsi="Courier New" w:cs="Courier New"/>
+          <w:sz w:val="22"/>
+          <w:szCs w:val="22"/>
+        </w:rPr>
+        <w:t xml:space="preserve">ook </w:t>
+      </w:r>
+      <w:r>
+        <w:rPr>
+          <w:rFonts w:ascii="Courier New" w:hAnsi="Courier New" w:cs="Courier New"/>
+          <w:sz w:val="22"/>
+          <w:szCs w:val="22"/>
+        </w:rPr>
+        <w:t>voor andere infrastructuren heel normaal is. Een goed functionerende democratie is geen luxe.</w:t>
+      </w:r>
+      <w:r>
+        <w:rPr>
+          <w:rFonts w:ascii="Courier New" w:hAnsi="Courier New" w:cs="Courier New"/>
+          <w:sz w:val="22"/>
+          <w:szCs w:val="22"/>
+        </w:rPr>
+        <w:t xml:space="preserve"> Democratie heeft een </w:t>
+      </w:r>
+      <w:r>
+        <w:rPr>
+          <w:rFonts w:ascii="Courier New" w:hAnsi="Courier New" w:cs="Courier New"/>
+          <w:sz w:val="22"/>
+          <w:szCs w:val="22"/>
+        </w:rPr>
+        <w:t>geode</w:t>
+      </w:r>
+      <w:r>
+        <w:rPr>
+          <w:rFonts w:ascii="Courier New" w:hAnsi="Courier New" w:cs="Courier New"/>
+          <w:sz w:val="22"/>
+          <w:szCs w:val="22"/>
+        </w:rPr>
+        <w:t xml:space="preserve"> communicatie nodig tussen overheid, experts en burgers, waarbij meer </w:t>
+      </w:r>
+      <w:r>
+        <w:rPr>
+          <w:rFonts w:ascii="Courier New" w:hAnsi="Courier New" w:cs="Courier New"/>
+          <w:sz w:val="22"/>
+          <w:szCs w:val="22"/>
+        </w:rPr>
+        <w:t xml:space="preserve">dan nu het geval is </w:t>
+      </w:r>
+      <w:r>
+        <w:rPr>
+          <w:rFonts w:ascii="Courier New" w:hAnsi="Courier New" w:cs="Courier New"/>
+          <w:sz w:val="22"/>
+          <w:szCs w:val="22"/>
+        </w:rPr>
+        <w:t xml:space="preserve">van burgers </w:t>
+      </w:r>
+      <w:r>
+        <w:rPr>
+          <w:rFonts w:ascii="Courier New" w:hAnsi="Courier New" w:cs="Courier New"/>
+          <w:sz w:val="22"/>
+          <w:szCs w:val="22"/>
+        </w:rPr>
+        <w:t xml:space="preserve">wordt </w:t>
+      </w:r>
+      <w:r>
+        <w:rPr>
+          <w:rFonts w:ascii="Courier New" w:hAnsi="Courier New" w:cs="Courier New"/>
+          <w:sz w:val="22"/>
+          <w:szCs w:val="22"/>
+        </w:rPr>
+        <w:t xml:space="preserve">geleerd en </w:t>
+      </w:r>
+      <w:r>
+        <w:rPr>
+          <w:rFonts w:ascii="Courier New" w:hAnsi="Courier New" w:cs="Courier New"/>
+          <w:sz w:val="22"/>
+          <w:szCs w:val="22"/>
+        </w:rPr>
+        <w:t>die burgers ook meer</w:t>
+      </w:r>
+      <w:r>
+        <w:rPr>
+          <w:rFonts w:ascii="Courier New" w:hAnsi="Courier New" w:cs="Courier New"/>
+          <w:sz w:val="22"/>
+          <w:szCs w:val="22"/>
+        </w:rPr>
+        <w:t xml:space="preserve"> vertrouwen krijgen. De burgers kunnen hier zelf initiatief toe nemen</w:t>
+      </w:r>
+      <w:r>
+        <w:rPr>
+          <w:rFonts w:ascii="Courier New" w:hAnsi="Courier New" w:cs="Courier New"/>
+          <w:sz w:val="22"/>
+          <w:szCs w:val="22"/>
+        </w:rPr>
+        <w:t>. MacLeod en Johnson geven spraakmakende voorbeelden, zoals het met elkaar verzamelen van</w:t>
+      </w:r>
+      <w:r>
+        <w:rPr>
+          <w:rFonts w:ascii="Courier New" w:hAnsi="Courier New" w:cs="Courier New"/>
+          <w:sz w:val="22"/>
+          <w:szCs w:val="22"/>
+        </w:rPr>
+        <w:t xml:space="preserve"> kindertanden </w:t>
+      </w:r>
+      <w:r>
+        <w:rPr>
+          <w:rFonts w:ascii="Courier New" w:hAnsi="Courier New" w:cs="Courier New"/>
+          <w:sz w:val="22"/>
+          <w:szCs w:val="22"/>
+        </w:rPr>
+        <w:t xml:space="preserve">om </w:t>
+      </w:r>
+      <w:r>
+        <w:rPr>
+          <w:rFonts w:ascii="Courier New" w:hAnsi="Courier New" w:cs="Courier New"/>
+          <w:sz w:val="22"/>
+          <w:szCs w:val="22"/>
+        </w:rPr>
+        <w:t xml:space="preserve">de invloed van </w:t>
+      </w:r>
+      <w:r>
+        <w:rPr>
+          <w:rFonts w:ascii="Courier New" w:hAnsi="Courier New" w:cs="Courier New"/>
+          <w:sz w:val="22"/>
+          <w:szCs w:val="22"/>
+        </w:rPr>
+        <w:t>het oefenen</w:t>
+      </w:r>
+      <w:r>
+        <w:rPr>
+          <w:rFonts w:ascii="Courier New" w:hAnsi="Courier New" w:cs="Courier New"/>
+          <w:sz w:val="22"/>
+          <w:szCs w:val="22"/>
+        </w:rPr>
+        <w:t xml:space="preserve"> met nucleaire wapens aan te tonen; de burgerinitiatieven in Canada om Syrische vluchtelingen op te vangen; het ‘stolperstein’-project in Duitsland om zichtbaar te maken waar Joden woonden voordat de Nazis kwamen. Ook </w:t>
+      </w:r>
+      <w:r>
+        <w:rPr>
+          <w:rFonts w:ascii="Courier New" w:hAnsi="Courier New" w:cs="Courier New"/>
+          <w:sz w:val="22"/>
+          <w:szCs w:val="22"/>
+        </w:rPr>
+        <w:t>kunnen er associaties gevormd worden om met elkaar te leren, betrokken te zijn te zijn en</w:t>
+      </w:r>
+      <w:r>
+        <w:rPr>
+          <w:rFonts w:ascii="Courier New" w:hAnsi="Courier New" w:cs="Courier New"/>
+          <w:sz w:val="22"/>
+          <w:szCs w:val="22"/>
+        </w:rPr>
+        <w:t xml:space="preserve"> </w:t>
+      </w:r>
+      <w:r>
+        <w:rPr>
+          <w:rFonts w:ascii="Courier New" w:hAnsi="Courier New" w:cs="Courier New"/>
+          <w:sz w:val="22"/>
+          <w:szCs w:val="22"/>
+        </w:rPr>
+        <w:t>algemeen belang en binding uit te drukken</w:t>
+      </w:r>
+      <w:r>
+        <w:rPr>
+          <w:rFonts w:ascii="Courier New" w:hAnsi="Courier New" w:cs="Courier New"/>
+          <w:sz w:val="22"/>
+          <w:szCs w:val="22"/>
+        </w:rPr>
+        <w:t>. Z</w:t>
+      </w:r>
+      <w:r>
+        <w:rPr>
+          <w:rFonts w:ascii="Courier New" w:hAnsi="Courier New" w:cs="Courier New"/>
+          <w:sz w:val="22"/>
+          <w:szCs w:val="22"/>
+        </w:rPr>
+        <w:t xml:space="preserve">oals </w:t>
+      </w:r>
+      <w:r>
+        <w:rPr>
+          <w:rFonts w:ascii="Courier New" w:hAnsi="Courier New" w:cs="Courier New"/>
+          <w:sz w:val="22"/>
+          <w:szCs w:val="22"/>
+        </w:rPr>
+        <w:t xml:space="preserve">dat gebeurt op </w:t>
+      </w:r>
+      <w:r>
+        <w:rPr>
+          <w:rFonts w:ascii="Courier New" w:hAnsi="Courier New" w:cs="Courier New"/>
+          <w:sz w:val="22"/>
+          <w:szCs w:val="22"/>
+        </w:rPr>
+        <w:t xml:space="preserve">de jaarlijkse Folkemødet in Denemarken, het land van de associaties, als meerdaags democratiefestival voor duizenden mensen; </w:t>
+      </w:r>
+      <w:r>
+        <w:rPr>
+          <w:rFonts w:ascii="Courier New" w:hAnsi="Courier New" w:cs="Courier New"/>
+          <w:sz w:val="22"/>
+          <w:szCs w:val="22"/>
+        </w:rPr>
+        <w:t xml:space="preserve">met </w:t>
+      </w:r>
+      <w:r>
+        <w:rPr>
+          <w:rFonts w:ascii="Courier New" w:hAnsi="Courier New" w:cs="Courier New"/>
+          <w:sz w:val="22"/>
+          <w:szCs w:val="22"/>
+        </w:rPr>
+        <w:t xml:space="preserve">de duizenden ‘People’s Association’ in Singaporte; en </w:t>
+      </w:r>
+      <w:r>
+        <w:rPr>
+          <w:rFonts w:ascii="Courier New" w:hAnsi="Courier New" w:cs="Courier New"/>
+          <w:sz w:val="22"/>
+          <w:szCs w:val="22"/>
+        </w:rPr>
+        <w:t xml:space="preserve">via </w:t>
+      </w:r>
+      <w:r>
+        <w:rPr>
+          <w:rFonts w:ascii="Courier New" w:hAnsi="Courier New" w:cs="Courier New"/>
+          <w:sz w:val="22"/>
+          <w:szCs w:val="22"/>
+        </w:rPr>
+        <w:t>Community of Businesses-coöperatie in Ann Arbor</w:t>
+      </w:r>
+      <w:r>
+        <w:rPr>
+          <w:rFonts w:ascii="Courier New" w:hAnsi="Courier New" w:cs="Courier New"/>
+          <w:sz w:val="22"/>
+          <w:szCs w:val="22"/>
+        </w:rPr>
+        <w:t>. H</w:t>
+      </w:r>
+      <w:r>
+        <w:rPr>
+          <w:rFonts w:ascii="Courier New" w:hAnsi="Courier New" w:cs="Courier New"/>
+          <w:sz w:val="22"/>
+          <w:szCs w:val="22"/>
+        </w:rPr>
+        <w:t xml:space="preserve">et kunnen ook kleinere gemeenschapsinitiatieven zijn zoals de Community Conferencing Center in Baltimore </w:t>
+      </w:r>
+      <w:r>
+        <w:rPr>
+          <w:rFonts w:ascii="Courier New" w:hAnsi="Courier New" w:cs="Courier New"/>
+          <w:sz w:val="22"/>
+          <w:szCs w:val="22"/>
+        </w:rPr>
+        <w:t xml:space="preserve">om </w:t>
+      </w:r>
+      <w:r>
+        <w:rPr>
+          <w:rFonts w:ascii="Courier New" w:hAnsi="Courier New" w:cs="Courier New"/>
+          <w:sz w:val="22"/>
+          <w:szCs w:val="22"/>
+        </w:rPr>
+        <w:t>incidenten, criminaliteit en conflicten met elkaar op te lossen</w:t>
+      </w:r>
+      <w:r>
+        <w:rPr>
+          <w:rFonts w:ascii="Courier New" w:hAnsi="Courier New" w:cs="Courier New"/>
+          <w:sz w:val="22"/>
+          <w:szCs w:val="22"/>
+        </w:rPr>
+        <w:t xml:space="preserve">; </w:t>
+      </w:r>
+      <w:r>
+        <w:rPr>
+          <w:rFonts w:ascii="Courier New" w:hAnsi="Courier New" w:cs="Courier New"/>
+          <w:sz w:val="22"/>
+          <w:szCs w:val="22"/>
+        </w:rPr>
+        <w:t>of het Frontier College dat in Nova Scotia begon om immigranten te helpen bij hun integratie</w:t>
       </w:r>
       <w:r>
         <w:rPr>
@@ -1654,6 +2160,14 @@
           <w:szCs w:val="22"/>
         </w:rPr>
         <w:t>. De volksvertegenwoordigingen, de festivals, de associaties en de coöperaties zijn vormen om een volgende stap in democratie te zetten</w:t>
+      </w:r>
+      <w:r>
+        <w:rPr>
+          <w:rFonts w:ascii="Courier New" w:hAnsi="Courier New" w:cs="Courier New"/>
+          <w:sz w:val="22"/>
+          <w:szCs w:val="22"/>
+        </w:rPr>
+        <w:t>.</w:t>
       </w:r>
       <w:r>
         <w:rPr>
@@ -1717,7 +2231,144 @@
           <w:sz w:val="22"/>
           <w:szCs w:val="22"/>
         </w:rPr>
-        <w:t>Derde weg</w:t>
+        <w:t xml:space="preserve">In het boek grijpen MacLeod en Johnson </w:t>
+      </w:r>
+      <w:r>
+        <w:rPr>
+          <w:rFonts w:ascii="Courier New" w:hAnsi="Courier New" w:cs="Courier New"/>
+          <w:sz w:val="22"/>
+          <w:szCs w:val="22"/>
+        </w:rPr>
+        <w:t xml:space="preserve">terug op een discussie die Lippmann en Dewey honderd jaar geleden met elkaar voerden. Lippmann was tijdens de Eerste Wereldoorlog adviseur van president Wilson en zag dat de publieke opinie een nieuwe vorm had gekregen. Mensen konden er door misleid worden en waren niet in staat om de politiek in al z’n complexiteit te volgen. Het was beter dit aan experts over </w:t>
+      </w:r>
+      <w:r>
+        <w:rPr>
+          <w:rFonts w:ascii="Courier New" w:hAnsi="Courier New" w:cs="Courier New"/>
+          <w:sz w:val="22"/>
+          <w:szCs w:val="22"/>
+        </w:rPr>
+        <w:lastRenderedPageBreak/>
+        <w:t xml:space="preserve">te laten, gewone mensen hun eigen ding konden doen en wel konden kiezen als het nodig was. </w:t>
+      </w:r>
+      <w:r>
+        <w:rPr>
+          <w:rFonts w:ascii="Courier New" w:hAnsi="Courier New" w:cs="Courier New"/>
+          <w:sz w:val="22"/>
+          <w:szCs w:val="22"/>
+        </w:rPr>
+        <w:t xml:space="preserve">Zo zou de democratie beter werken. </w:t>
+      </w:r>
+      <w:r>
+        <w:rPr>
+          <w:rFonts w:ascii="Courier New" w:hAnsi="Courier New" w:cs="Courier New"/>
+          <w:sz w:val="22"/>
+          <w:szCs w:val="22"/>
+        </w:rPr>
+        <w:t>Dewey wist dat het Lippmann ging om versterken van democratie</w:t>
+      </w:r>
+      <w:r>
+        <w:rPr>
+          <w:rFonts w:ascii="Courier New" w:hAnsi="Courier New" w:cs="Courier New"/>
+          <w:sz w:val="22"/>
+          <w:szCs w:val="22"/>
+        </w:rPr>
+        <w:t>,</w:t>
+      </w:r>
+      <w:r>
+        <w:rPr>
+          <w:rFonts w:ascii="Courier New" w:hAnsi="Courier New" w:cs="Courier New"/>
+          <w:sz w:val="22"/>
+          <w:szCs w:val="22"/>
+        </w:rPr>
+        <w:t xml:space="preserve"> maar</w:t>
+      </w:r>
+      <w:r>
+        <w:rPr>
+          <w:rFonts w:ascii="Courier New" w:hAnsi="Courier New" w:cs="Courier New"/>
+          <w:sz w:val="22"/>
+          <w:szCs w:val="22"/>
+        </w:rPr>
+        <w:t xml:space="preserve"> ging verder in zijn idee</w:t>
+      </w:r>
+      <w:r>
+        <w:rPr>
+          <w:rFonts w:ascii="Courier New" w:hAnsi="Courier New" w:cs="Courier New"/>
+          <w:sz w:val="22"/>
+          <w:szCs w:val="22"/>
+        </w:rPr>
+        <w:t xml:space="preserve"> over democratie. D</w:t>
+      </w:r>
+      <w:r>
+        <w:rPr>
+          <w:rFonts w:ascii="Courier New" w:hAnsi="Courier New" w:cs="Courier New"/>
+          <w:sz w:val="22"/>
+          <w:szCs w:val="22"/>
+        </w:rPr>
+        <w:t>emocratie</w:t>
+      </w:r>
+      <w:r>
+        <w:rPr>
+          <w:rFonts w:ascii="Courier New" w:hAnsi="Courier New" w:cs="Courier New"/>
+          <w:sz w:val="22"/>
+          <w:szCs w:val="22"/>
+        </w:rPr>
+        <w:t xml:space="preserve"> kun je niet aan experts alleen over laten. Als je schoen problemen veroorza</w:t>
+      </w:r>
+      <w:r>
+        <w:rPr>
+          <w:rFonts w:ascii="Courier New" w:hAnsi="Courier New" w:cs="Courier New"/>
+          <w:sz w:val="22"/>
+          <w:szCs w:val="22"/>
+        </w:rPr>
+        <w:t>akt</w:t>
+      </w:r>
+      <w:r>
+        <w:rPr>
+          <w:rFonts w:ascii="Courier New" w:hAnsi="Courier New" w:cs="Courier New"/>
+          <w:sz w:val="22"/>
+          <w:szCs w:val="22"/>
+        </w:rPr>
+        <w:t xml:space="preserve"> moet je naar de schoenmaker, </w:t>
+      </w:r>
+      <w:r>
+        <w:rPr>
+          <w:rFonts w:ascii="Courier New" w:hAnsi="Courier New" w:cs="Courier New"/>
+          <w:sz w:val="22"/>
+          <w:szCs w:val="22"/>
+        </w:rPr>
+        <w:t>zo schreef hij, alleen</w:t>
+      </w:r>
+      <w:r>
+        <w:rPr>
+          <w:rFonts w:ascii="Courier New" w:hAnsi="Courier New" w:cs="Courier New"/>
+          <w:sz w:val="22"/>
+          <w:szCs w:val="22"/>
+        </w:rPr>
+        <w:t xml:space="preserve"> jij als schoenendrager het beste uitleggen waar het precies in de schoen wringt. </w:t>
+      </w:r>
+      <w:r>
+        <w:rPr>
+          <w:rFonts w:ascii="Courier New" w:hAnsi="Courier New" w:cs="Courier New"/>
+          <w:sz w:val="22"/>
+          <w:szCs w:val="22"/>
+        </w:rPr>
+        <w:t xml:space="preserve">En zo is dat in een democratie ook. </w:t>
+      </w:r>
+      <w:r>
+        <w:rPr>
+          <w:rFonts w:ascii="Courier New" w:hAnsi="Courier New" w:cs="Courier New"/>
+          <w:sz w:val="22"/>
+          <w:szCs w:val="22"/>
+        </w:rPr>
+        <w:t xml:space="preserve">Lippmanns gedachten horen bij het eerste bedrijf van de democratie, Deweys ideeën horen bij het tweede bedrijf. Het eerste bedrijf met z’n politieke vertegenwoordiging, vrije pers, onafhankelijk juridisch systeem en stemrecht voor iedereen moet nog steeds verdedigd worden. Maar er zijn nieuwe problemen bij gekomen die vooral het publieke informatiesysteem raken met de nieuwe plaforms van sociale media, misinformatie en polarisatie die de democratie raken en die nieuwe antwoorden vragen. </w:t>
+      </w:r>
+      <w:r>
+        <w:rPr>
+          <w:rFonts w:ascii="Courier New" w:hAnsi="Courier New" w:cs="Courier New"/>
+          <w:sz w:val="22"/>
+          <w:szCs w:val="22"/>
+        </w:rPr>
+        <w:t>De nieuwe sociale situatie vraagt de invloed van meer mensen en van meer publieken om met elkaar te overleggen, beslissingen te nemen en problemen op te lossen en die de democratie sterker maken, gedeelder maken en levendiger maken. Hier ligt ook de opdracht van democratische instituten om publieken beter geinformeerd, betrokken en productiever te maken. En de politiek heeft de taak de representatie meer te delen en er voor te zorgen dat mensen er toe doen, gehoord worden en meetellen, niet op een populistische maar op een democratische manier.</w:t>
       </w:r>
     </w:p>
     <w:p>
@@ -1729,22 +2380,31 @@
           <w:szCs w:val="22"/>
         </w:rPr>
       </w:pPr>
-      <w:r>
-        <w:rPr>
-          <w:rFonts w:ascii="Courier New" w:hAnsi="Courier New" w:cs="Courier New"/>
-          <w:sz w:val="22"/>
-          <w:szCs w:val="22"/>
-        </w:rPr>
-        <w:t xml:space="preserve">Gaat terug op een discussie die Lippmann en Dewey honderd jaar geleden met elkaar voerden. Lippmann was tijdens de Eerste Wereldoorlog adviseur van president Wilson en zag dat de publieke opinie een nieuwe vorm had gekregen. Mensen konden er door misleid worden en waren niet in staat om de politiek in al z’n complexiteit te volgen. Het was beter dit aan experts over te laten, gewone </w:t>
-      </w:r>
-      <w:r>
-        <w:rPr>
-          <w:rFonts w:ascii="Courier New" w:hAnsi="Courier New" w:cs="Courier New"/>
-          <w:sz w:val="22"/>
-          <w:szCs w:val="22"/>
-        </w:rPr>
-        <w:lastRenderedPageBreak/>
-        <w:t xml:space="preserve">mensen hun eigen ding konden doen en wel konden kiezen als het nodig was. Dewey wist dat het Lippmann ging om versterken van democratie maar had een ander idee over democratie. Dat kun je niet aan experts alleen over laten. Als je schoen problemen veroorzaken moet je naar de schoenmaker, maar jij als schoenendrager kunt nog steeds het beste uitleggen waar het precies in de schoen wringt.  </w:t>
+    </w:p>
+    <w:p>
+      <w:pPr>
+        <w:spacing w:line="360" w:lineRule="auto"/>
+        <w:rPr>
+          <w:rFonts w:ascii="Courier New" w:hAnsi="Courier New" w:cs="Courier New"/>
+          <w:sz w:val="22"/>
+          <w:szCs w:val="22"/>
+        </w:rPr>
+      </w:pPr>
+      <w:r>
+        <w:rPr>
+          <w:rFonts w:ascii="Courier New" w:hAnsi="Courier New" w:cs="Courier New"/>
+          <w:sz w:val="22"/>
+          <w:szCs w:val="22"/>
+        </w:rPr>
+        <w:t xml:space="preserve"> </w:t>
+      </w:r>
+      <w:r>
+        <w:rPr>
+          <w:rFonts w:ascii="Courier New" w:hAnsi="Courier New" w:cs="Courier New"/>
+          <w:sz w:val="22"/>
+          <w:szCs w:val="22"/>
+        </w:rPr>
+        <w:t xml:space="preserve"> </w:t>
       </w:r>
     </w:p>
     <w:p>

</xml_diff>

<commit_message>
26-07-26, Deliberatieve democratie geplaatst
</commit_message>
<xml_diff>
--- a/BlogsWord/Deliberatievedemocratie.docx
+++ b/BlogsWord/Deliberatievedemocratie.docx
@@ -319,7 +319,23 @@
           <w:sz w:val="22"/>
           <w:szCs w:val="22"/>
         </w:rPr>
-        <w:t>bijdragen aan</w:t>
+        <w:t xml:space="preserve">dragen </w:t>
+      </w:r>
+      <w:r>
+        <w:rPr>
+          <w:rFonts w:ascii="Courier New" w:hAnsi="Courier New" w:cs="Courier New"/>
+          <w:sz w:val="22"/>
+          <w:szCs w:val="22"/>
+        </w:rPr>
+        <w:t xml:space="preserve">bij </w:t>
+      </w:r>
+      <w:r>
+        <w:rPr>
+          <w:rFonts w:ascii="Courier New" w:hAnsi="Courier New" w:cs="Courier New"/>
+          <w:sz w:val="22"/>
+          <w:szCs w:val="22"/>
+        </w:rPr>
+        <w:t>aan</w:t>
       </w:r>
       <w:r>
         <w:rPr>
@@ -343,7 +359,39 @@
           <w:sz w:val="22"/>
           <w:szCs w:val="22"/>
         </w:rPr>
-        <w:t xml:space="preserve"> de kern in van de boodschap die MacLeod en Johnson met hun boek willen uitdragen</w:t>
+        <w:t xml:space="preserve"> de kern in van de boodschap die </w:t>
+      </w:r>
+      <w:r>
+        <w:rPr>
+          <w:rFonts w:ascii="Courier New" w:hAnsi="Courier New" w:cs="Courier New"/>
+          <w:sz w:val="22"/>
+          <w:szCs w:val="22"/>
+        </w:rPr>
+        <w:t>de twee Canadesen (</w:t>
+      </w:r>
+      <w:r>
+        <w:rPr>
+          <w:rFonts w:ascii="Courier New" w:hAnsi="Courier New" w:cs="Courier New"/>
+          <w:sz w:val="22"/>
+          <w:szCs w:val="22"/>
+        </w:rPr>
+        <w:t>MacLeod en Johnson</w:t>
+      </w:r>
+      <w:r>
+        <w:rPr>
+          <w:rFonts w:ascii="Courier New" w:hAnsi="Courier New" w:cs="Courier New"/>
+          <w:sz w:val="22"/>
+          <w:szCs w:val="22"/>
+        </w:rPr>
+        <w:t>)</w:t>
+      </w:r>
+      <w:r>
+        <w:rPr>
+          <w:rFonts w:ascii="Courier New" w:hAnsi="Courier New" w:cs="Courier New"/>
+          <w:sz w:val="22"/>
+          <w:szCs w:val="22"/>
+        </w:rPr>
+        <w:t>met hun boek willen uitdragen</w:t>
       </w:r>
       <w:r>
         <w:rPr>
@@ -546,7 +594,7 @@
           <w:sz w:val="22"/>
           <w:szCs w:val="22"/>
         </w:rPr>
-        <w:t xml:space="preserve">ook een nieuwe fase nodig heeft om </w:t>
+        <w:t xml:space="preserve">ook een nieuwe fase nodig om </w:t>
       </w:r>
       <w:r>
         <w:rPr>
@@ -602,7 +650,15 @@
           <w:sz w:val="22"/>
           <w:szCs w:val="22"/>
         </w:rPr>
-        <w:t xml:space="preserve"> en </w:t>
+        <w:t>,</w:t>
+      </w:r>
+      <w:r>
+        <w:rPr>
+          <w:rFonts w:ascii="Courier New" w:hAnsi="Courier New" w:cs="Courier New"/>
+          <w:sz w:val="22"/>
+          <w:szCs w:val="22"/>
+        </w:rPr>
+        <w:t xml:space="preserve"> </w:t>
       </w:r>
       <w:r>
         <w:rPr>
@@ -618,7 +674,15 @@
           <w:sz w:val="22"/>
           <w:szCs w:val="22"/>
         </w:rPr>
-        <w:t xml:space="preserve"> en de </w:t>
+        <w:t>. Het gaat over de</w:t>
+      </w:r>
+      <w:r>
+        <w:rPr>
+          <w:rFonts w:ascii="Courier New" w:hAnsi="Courier New" w:cs="Courier New"/>
+          <w:sz w:val="22"/>
+          <w:szCs w:val="22"/>
+        </w:rPr>
+        <w:t xml:space="preserve"> </w:t>
       </w:r>
       <w:r>
         <w:rPr>
@@ -634,7 +698,39 @@
           <w:sz w:val="22"/>
           <w:szCs w:val="22"/>
         </w:rPr>
-        <w:t>die mensen hebben en erbij nodig zijn. En het gaat over</w:t>
+        <w:t xml:space="preserve">die mensen hebben en </w:t>
+      </w:r>
+      <w:r>
+        <w:rPr>
+          <w:rFonts w:ascii="Courier New" w:hAnsi="Courier New" w:cs="Courier New"/>
+          <w:sz w:val="22"/>
+          <w:szCs w:val="22"/>
+        </w:rPr>
+        <w:t xml:space="preserve">die </w:t>
+      </w:r>
+      <w:r>
+        <w:rPr>
+          <w:rFonts w:ascii="Courier New" w:hAnsi="Courier New" w:cs="Courier New"/>
+          <w:sz w:val="22"/>
+          <w:szCs w:val="22"/>
+        </w:rPr>
+        <w:t xml:space="preserve">erbij nodig zijn. En het gaat </w:t>
+      </w:r>
+      <w:r>
+        <w:rPr>
+          <w:rFonts w:ascii="Courier New" w:hAnsi="Courier New" w:cs="Courier New"/>
+          <w:sz w:val="22"/>
+          <w:szCs w:val="22"/>
+        </w:rPr>
+        <w:t xml:space="preserve">ook </w:t>
+      </w:r>
+      <w:r>
+        <w:rPr>
+          <w:rFonts w:ascii="Courier New" w:hAnsi="Courier New" w:cs="Courier New"/>
+          <w:sz w:val="22"/>
+          <w:szCs w:val="22"/>
+        </w:rPr>
+        <w:t>over</w:t>
       </w:r>
       <w:r>
         <w:rPr>
@@ -683,7 +779,23 @@
           <w:sz w:val="22"/>
           <w:szCs w:val="22"/>
         </w:rPr>
-        <w:t>. Hier wordt getoond dat mensen</w:t>
+        <w:t xml:space="preserve">. </w:t>
+      </w:r>
+      <w:r>
+        <w:rPr>
+          <w:rFonts w:ascii="Courier New" w:hAnsi="Courier New" w:cs="Courier New"/>
+          <w:sz w:val="22"/>
+          <w:szCs w:val="22"/>
+        </w:rPr>
+        <w:t>In die publieken</w:t>
+      </w:r>
+      <w:r>
+        <w:rPr>
+          <w:rFonts w:ascii="Courier New" w:hAnsi="Courier New" w:cs="Courier New"/>
+          <w:sz w:val="22"/>
+          <w:szCs w:val="22"/>
+        </w:rPr>
+        <w:t xml:space="preserve"> wordt getoond dat mensen</w:t>
       </w:r>
       <w:r>
         <w:rPr>
@@ -707,15 +819,7 @@
           <w:sz w:val="22"/>
           <w:szCs w:val="22"/>
         </w:rPr>
-        <w:t>Met</w:t>
-      </w:r>
-      <w:r>
-        <w:rPr>
-          <w:rFonts w:ascii="Courier New" w:hAnsi="Courier New" w:cs="Courier New"/>
-          <w:sz w:val="22"/>
-          <w:szCs w:val="22"/>
-        </w:rPr>
-        <w:t xml:space="preserve"> publieken </w:t>
+        <w:t xml:space="preserve">Daar </w:t>
       </w:r>
       <w:r>
         <w:rPr>
@@ -739,15 +843,15 @@
           <w:sz w:val="22"/>
           <w:szCs w:val="22"/>
         </w:rPr>
-        <w:t xml:space="preserve">voorbij hun eigen belang komen en waarmee ze </w:t>
-      </w:r>
-      <w:r>
-        <w:rPr>
-          <w:rFonts w:ascii="Courier New" w:hAnsi="Courier New" w:cs="Courier New"/>
-          <w:sz w:val="22"/>
-          <w:szCs w:val="22"/>
-        </w:rPr>
-        <w:t xml:space="preserve">hun wederkerigheid kunnen tonen. </w:t>
+        <w:t xml:space="preserve">voorbij hun eigen belang komen en </w:t>
+      </w:r>
+      <w:r>
+        <w:rPr>
+          <w:rFonts w:ascii="Courier New" w:hAnsi="Courier New" w:cs="Courier New"/>
+          <w:sz w:val="22"/>
+          <w:szCs w:val="22"/>
+        </w:rPr>
+        <w:t xml:space="preserve">hun wederkerigheid tonen. </w:t>
       </w:r>
     </w:p>
     <w:p>
@@ -870,7 +974,23 @@
           <w:sz w:val="22"/>
           <w:szCs w:val="22"/>
         </w:rPr>
-        <w:t xml:space="preserve">Mensen hebben platforms nodig om samen te werken en democratie is de praktijk </w:t>
+        <w:t>Mensen hebben platforms nodig om samen te werken</w:t>
+      </w:r>
+      <w:r>
+        <w:rPr>
+          <w:rFonts w:ascii="Courier New" w:hAnsi="Courier New" w:cs="Courier New"/>
+          <w:sz w:val="22"/>
+          <w:szCs w:val="22"/>
+        </w:rPr>
+        <w:t>. D</w:t>
+      </w:r>
+      <w:r>
+        <w:rPr>
+          <w:rFonts w:ascii="Courier New" w:hAnsi="Courier New" w:cs="Courier New"/>
+          <w:sz w:val="22"/>
+          <w:szCs w:val="22"/>
+        </w:rPr>
+        <w:t xml:space="preserve">emocratie is de praktijk </w:t>
       </w:r>
       <w:r>
         <w:rPr>
@@ -1337,23 +1457,143 @@
           <w:sz w:val="22"/>
           <w:szCs w:val="22"/>
         </w:rPr>
-        <w:t xml:space="preserve">Een steeds belangrijker onderdeel van publieke opinie in een vertegenwoordigende democratie is de peiling geworden waarmee de mening van de burger op een eenvoudige manier gemeten wordt. De beperking daarvan wordt steeds meer ingezien. Het ondermijnt democratie steeds meer en het wordt een gereedschap om afwijkende meningen te onderdrukken en de verschillen tussen groepen uit te buiten. In de democratieën van tegenwoordig loopt de vrije pers ook </w:t>
-      </w:r>
-      <w:r>
-        <w:rPr>
-          <w:rFonts w:ascii="Courier New" w:hAnsi="Courier New" w:cs="Courier New"/>
-          <w:sz w:val="22"/>
-          <w:szCs w:val="22"/>
-        </w:rPr>
-        <w:t xml:space="preserve">steeds meer </w:t>
-      </w:r>
-      <w:r>
-        <w:rPr>
-          <w:rFonts w:ascii="Courier New" w:hAnsi="Courier New" w:cs="Courier New"/>
-          <w:sz w:val="22"/>
-          <w:szCs w:val="22"/>
-        </w:rPr>
-        <w:t xml:space="preserve">gevaar omdat de nieuwsgaring in handen is van een kleine groep hele rijke mensen en bedrijven die niet veel op hebben met het algemeen belang. En de manier waarop jongeren via sociale media worden benaderd. </w:t>
+        <w:t xml:space="preserve">Een steeds belangrijker onderdeel van publieke opinie in een vertegenwoordigende democratie is de peiling geworden waarmee de mening van de burger op een eenvoudige manier gemeten wordt. De beperking daarvan wordt steeds meer ingezien. </w:t>
+      </w:r>
+      <w:r>
+        <w:rPr>
+          <w:rFonts w:ascii="Courier New" w:hAnsi="Courier New" w:cs="Courier New"/>
+          <w:sz w:val="22"/>
+          <w:szCs w:val="22"/>
+        </w:rPr>
+        <w:t>Peilingen</w:t>
+      </w:r>
+      <w:r>
+        <w:rPr>
+          <w:rFonts w:ascii="Courier New" w:hAnsi="Courier New" w:cs="Courier New"/>
+          <w:sz w:val="22"/>
+          <w:szCs w:val="22"/>
+        </w:rPr>
+        <w:t xml:space="preserve"> ondermijn</w:t>
+      </w:r>
+      <w:r>
+        <w:rPr>
+          <w:rFonts w:ascii="Courier New" w:hAnsi="Courier New" w:cs="Courier New"/>
+          <w:sz w:val="22"/>
+          <w:szCs w:val="22"/>
+        </w:rPr>
+        <w:t>en de</w:t>
+      </w:r>
+      <w:r>
+        <w:rPr>
+          <w:rFonts w:ascii="Courier New" w:hAnsi="Courier New" w:cs="Courier New"/>
+          <w:sz w:val="22"/>
+          <w:szCs w:val="22"/>
+        </w:rPr>
+        <w:t xml:space="preserve"> democratie steeds meer en </w:t>
+      </w:r>
+      <w:r>
+        <w:rPr>
+          <w:rFonts w:ascii="Courier New" w:hAnsi="Courier New" w:cs="Courier New"/>
+          <w:sz w:val="22"/>
+          <w:szCs w:val="22"/>
+        </w:rPr>
+        <w:t>ze</w:t>
+      </w:r>
+      <w:r>
+        <w:rPr>
+          <w:rFonts w:ascii="Courier New" w:hAnsi="Courier New" w:cs="Courier New"/>
+          <w:sz w:val="22"/>
+          <w:szCs w:val="22"/>
+        </w:rPr>
+        <w:t xml:space="preserve"> word</w:t>
+      </w:r>
+      <w:r>
+        <w:rPr>
+          <w:rFonts w:ascii="Courier New" w:hAnsi="Courier New" w:cs="Courier New"/>
+          <w:sz w:val="22"/>
+          <w:szCs w:val="22"/>
+        </w:rPr>
+        <w:t>en eerder</w:t>
+      </w:r>
+      <w:r>
+        <w:rPr>
+          <w:rFonts w:ascii="Courier New" w:hAnsi="Courier New" w:cs="Courier New"/>
+          <w:sz w:val="22"/>
+          <w:szCs w:val="22"/>
+        </w:rPr>
+        <w:t xml:space="preserve"> een gereedschap om afwijkende meningen </w:t>
+      </w:r>
+      <w:r>
+        <w:rPr>
+          <w:rFonts w:ascii="Courier New" w:hAnsi="Courier New" w:cs="Courier New"/>
+          <w:sz w:val="22"/>
+          <w:szCs w:val="22"/>
+        </w:rPr>
+        <w:t xml:space="preserve">mee </w:t>
+      </w:r>
+      <w:r>
+        <w:rPr>
+          <w:rFonts w:ascii="Courier New" w:hAnsi="Courier New" w:cs="Courier New"/>
+          <w:sz w:val="22"/>
+          <w:szCs w:val="22"/>
+        </w:rPr>
+        <w:t xml:space="preserve">te onderdrukken en verschillen tussen groepen uit te buiten. In de democratieën van tegenwoordig loopt de vrije pers ook steeds meer gevaar omdat de nieuwsgaring in handen is van een kleine groep hele rijke mensen en bedrijven die </w:t>
+      </w:r>
+      <w:r>
+        <w:rPr>
+          <w:rFonts w:ascii="Courier New" w:hAnsi="Courier New" w:cs="Courier New"/>
+          <w:sz w:val="22"/>
+          <w:szCs w:val="22"/>
+        </w:rPr>
+        <w:t>minder</w:t>
+      </w:r>
+      <w:r>
+        <w:rPr>
+          <w:rFonts w:ascii="Courier New" w:hAnsi="Courier New" w:cs="Courier New"/>
+          <w:sz w:val="22"/>
+          <w:szCs w:val="22"/>
+        </w:rPr>
+        <w:t xml:space="preserve"> op hebben met het algemeen belang</w:t>
+      </w:r>
+      <w:r>
+        <w:rPr>
+          <w:rFonts w:ascii="Courier New" w:hAnsi="Courier New" w:cs="Courier New"/>
+          <w:sz w:val="22"/>
+          <w:szCs w:val="22"/>
+        </w:rPr>
+        <w:t xml:space="preserve"> dan met het eigen belang</w:t>
+      </w:r>
+      <w:r>
+        <w:rPr>
+          <w:rFonts w:ascii="Courier New" w:hAnsi="Courier New" w:cs="Courier New"/>
+          <w:sz w:val="22"/>
+          <w:szCs w:val="22"/>
+        </w:rPr>
+        <w:t>. En d</w:t>
+      </w:r>
+      <w:r>
+        <w:rPr>
+          <w:rFonts w:ascii="Courier New" w:hAnsi="Courier New" w:cs="Courier New"/>
+          <w:sz w:val="22"/>
+          <w:szCs w:val="22"/>
+        </w:rPr>
+        <w:t>an is er nog de</w:t>
+      </w:r>
+      <w:r>
+        <w:rPr>
+          <w:rFonts w:ascii="Courier New" w:hAnsi="Courier New" w:cs="Courier New"/>
+          <w:sz w:val="22"/>
+          <w:szCs w:val="22"/>
+        </w:rPr>
+        <w:t xml:space="preserve"> manier waarop jongeren via sociale media worden benaderd</w:t>
+      </w:r>
+      <w:r>
+        <w:rPr>
+          <w:rFonts w:ascii="Courier New" w:hAnsi="Courier New" w:cs="Courier New"/>
+          <w:sz w:val="22"/>
+          <w:szCs w:val="22"/>
+        </w:rPr>
+        <w:t xml:space="preserve"> en die steeds meer kritiek oproept.</w:t>
       </w:r>
     </w:p>
     <w:p>
@@ -1412,7 +1652,23 @@
           <w:sz w:val="22"/>
           <w:szCs w:val="22"/>
         </w:rPr>
-        <w:t xml:space="preserve">niet altijd eenvoudig en succesvol, maar </w:t>
+        <w:t>niet altijd eenvoudig en succesvol</w:t>
+      </w:r>
+      <w:r>
+        <w:rPr>
+          <w:rFonts w:ascii="Courier New" w:hAnsi="Courier New" w:cs="Courier New"/>
+          <w:sz w:val="22"/>
+          <w:szCs w:val="22"/>
+        </w:rPr>
+        <w:t>. M</w:t>
+      </w:r>
+      <w:r>
+        <w:rPr>
+          <w:rFonts w:ascii="Courier New" w:hAnsi="Courier New" w:cs="Courier New"/>
+          <w:sz w:val="22"/>
+          <w:szCs w:val="22"/>
+        </w:rPr>
+        <w:t xml:space="preserve">aar </w:t>
       </w:r>
       <w:r>
         <w:rPr>
@@ -1428,15 +1684,47 @@
           <w:sz w:val="22"/>
           <w:szCs w:val="22"/>
         </w:rPr>
-        <w:t xml:space="preserve"> initiatieven om met elkaar problemen op te lossen door</w:t>
-      </w:r>
-      <w:r>
-        <w:rPr>
-          <w:rFonts w:ascii="Courier New" w:hAnsi="Courier New" w:cs="Courier New"/>
-          <w:sz w:val="22"/>
-          <w:szCs w:val="22"/>
-        </w:rPr>
-        <w:t xml:space="preserve"> vertegenwoordigende groepen die naar het algemeen belang kijken </w:t>
+        <w:t xml:space="preserve"> initiatieven</w:t>
+      </w:r>
+      <w:r>
+        <w:rPr>
+          <w:rFonts w:ascii="Courier New" w:hAnsi="Courier New" w:cs="Courier New"/>
+          <w:sz w:val="22"/>
+          <w:szCs w:val="22"/>
+        </w:rPr>
+        <w:t>,</w:t>
+      </w:r>
+      <w:r>
+        <w:rPr>
+          <w:rFonts w:ascii="Courier New" w:hAnsi="Courier New" w:cs="Courier New"/>
+          <w:sz w:val="22"/>
+          <w:szCs w:val="22"/>
+        </w:rPr>
+        <w:t xml:space="preserve"> om met elkaar problemen op te lossen door</w:t>
+      </w:r>
+      <w:r>
+        <w:rPr>
+          <w:rFonts w:ascii="Courier New" w:hAnsi="Courier New" w:cs="Courier New"/>
+          <w:sz w:val="22"/>
+          <w:szCs w:val="22"/>
+        </w:rPr>
+        <w:t xml:space="preserve"> vertegenwoordigende groepen die naar het algemeen belang kijken</w:t>
+      </w:r>
+      <w:r>
+        <w:rPr>
+          <w:rFonts w:ascii="Courier New" w:hAnsi="Courier New" w:cs="Courier New"/>
+          <w:sz w:val="22"/>
+          <w:szCs w:val="22"/>
+        </w:rPr>
+        <w:t>,</w:t>
+      </w:r>
+      <w:r>
+        <w:rPr>
+          <w:rFonts w:ascii="Courier New" w:hAnsi="Courier New" w:cs="Courier New"/>
+          <w:sz w:val="22"/>
+          <w:szCs w:val="22"/>
+        </w:rPr>
+        <w:t xml:space="preserve"> </w:t>
       </w:r>
       <w:r>
         <w:rPr>
@@ -1646,15 +1934,400 @@
           <w:sz w:val="22"/>
           <w:szCs w:val="22"/>
         </w:rPr>
-        <w:t xml:space="preserve">een kracht voor creatieve politiek wordt. </w:t>
-      </w:r>
-      <w:r>
-        <w:rPr>
-          <w:rFonts w:ascii="Courier New" w:hAnsi="Courier New" w:cs="Courier New"/>
-          <w:sz w:val="22"/>
-          <w:szCs w:val="22"/>
-        </w:rPr>
-        <w:t>Hoe van het publiek is te leren is</w:t>
+        <w:t xml:space="preserve">een kracht voor creatieve politiek </w:t>
+      </w:r>
+      <w:r>
+        <w:rPr>
+          <w:rFonts w:ascii="Courier New" w:hAnsi="Courier New" w:cs="Courier New"/>
+          <w:sz w:val="22"/>
+          <w:szCs w:val="22"/>
+        </w:rPr>
+        <w:t>is ge</w:t>
+      </w:r>
+      <w:r>
+        <w:rPr>
+          <w:rFonts w:ascii="Courier New" w:hAnsi="Courier New" w:cs="Courier New"/>
+          <w:sz w:val="22"/>
+          <w:szCs w:val="22"/>
+        </w:rPr>
+        <w:t>word</w:t>
+      </w:r>
+      <w:r>
+        <w:rPr>
+          <w:rFonts w:ascii="Courier New" w:hAnsi="Courier New" w:cs="Courier New"/>
+          <w:sz w:val="22"/>
+          <w:szCs w:val="22"/>
+        </w:rPr>
+        <w:t>en</w:t>
+      </w:r>
+      <w:r>
+        <w:rPr>
+          <w:rFonts w:ascii="Courier New" w:hAnsi="Courier New" w:cs="Courier New"/>
+          <w:sz w:val="22"/>
+          <w:szCs w:val="22"/>
+        </w:rPr>
+        <w:t xml:space="preserve">. </w:t>
+      </w:r>
+      <w:r>
+        <w:rPr>
+          <w:rFonts w:ascii="Courier New" w:hAnsi="Courier New" w:cs="Courier New"/>
+          <w:sz w:val="22"/>
+          <w:szCs w:val="22"/>
+        </w:rPr>
+        <w:t>Over h</w:t>
+      </w:r>
+      <w:r>
+        <w:rPr>
+          <w:rFonts w:ascii="Courier New" w:hAnsi="Courier New" w:cs="Courier New"/>
+          <w:sz w:val="22"/>
+          <w:szCs w:val="22"/>
+        </w:rPr>
+        <w:t xml:space="preserve">oe van het publiek </w:t>
+      </w:r>
+      <w:r>
+        <w:rPr>
+          <w:rFonts w:ascii="Courier New" w:hAnsi="Courier New" w:cs="Courier New"/>
+          <w:sz w:val="22"/>
+          <w:szCs w:val="22"/>
+        </w:rPr>
+        <w:lastRenderedPageBreak/>
+        <w:t>is te leren is</w:t>
+      </w:r>
+      <w:r>
+        <w:rPr>
+          <w:rFonts w:ascii="Courier New" w:hAnsi="Courier New" w:cs="Courier New"/>
+          <w:sz w:val="22"/>
+          <w:szCs w:val="22"/>
+        </w:rPr>
+        <w:t xml:space="preserve"> veel </w:t>
+      </w:r>
+      <w:r>
+        <w:rPr>
+          <w:rFonts w:ascii="Courier New" w:hAnsi="Courier New" w:cs="Courier New"/>
+          <w:sz w:val="22"/>
+          <w:szCs w:val="22"/>
+        </w:rPr>
+        <w:t>op te steken</w:t>
+      </w:r>
+      <w:r>
+        <w:rPr>
+          <w:rFonts w:ascii="Courier New" w:hAnsi="Courier New" w:cs="Courier New"/>
+          <w:sz w:val="22"/>
+          <w:szCs w:val="22"/>
+        </w:rPr>
+        <w:t xml:space="preserve"> van</w:t>
+      </w:r>
+      <w:r>
+        <w:rPr>
+          <w:rFonts w:ascii="Courier New" w:hAnsi="Courier New" w:cs="Courier New"/>
+          <w:sz w:val="22"/>
+          <w:szCs w:val="22"/>
+        </w:rPr>
+        <w:t xml:space="preserve"> wetenschappers als</w:t>
+      </w:r>
+      <w:r>
+        <w:rPr>
+          <w:rFonts w:ascii="Courier New" w:hAnsi="Courier New" w:cs="Courier New"/>
+          <w:sz w:val="22"/>
+          <w:szCs w:val="22"/>
+        </w:rPr>
+        <w:t xml:space="preserve"> Rosling (Zweden), Suzuki (Canada) en Nye (Amerika)</w:t>
+      </w:r>
+      <w:r>
+        <w:rPr>
+          <w:rFonts w:ascii="Courier New" w:hAnsi="Courier New" w:cs="Courier New"/>
+          <w:sz w:val="22"/>
+          <w:szCs w:val="22"/>
+        </w:rPr>
+        <w:t xml:space="preserve">, wetenschappers </w:t>
+      </w:r>
+      <w:r>
+        <w:rPr>
+          <w:rFonts w:ascii="Courier New" w:hAnsi="Courier New" w:cs="Courier New"/>
+          <w:sz w:val="22"/>
+          <w:szCs w:val="22"/>
+        </w:rPr>
+        <w:t>bij wie het</w:t>
+      </w:r>
+      <w:r>
+        <w:rPr>
+          <w:rFonts w:ascii="Courier New" w:hAnsi="Courier New" w:cs="Courier New"/>
+          <w:sz w:val="22"/>
+          <w:szCs w:val="22"/>
+        </w:rPr>
+        <w:t xml:space="preserve"> om de </w:t>
+      </w:r>
+      <w:r>
+        <w:rPr>
+          <w:rFonts w:ascii="Courier New" w:hAnsi="Courier New" w:cs="Courier New"/>
+          <w:sz w:val="22"/>
+          <w:szCs w:val="22"/>
+        </w:rPr>
+        <w:t xml:space="preserve">liefde van kennis </w:t>
+      </w:r>
+      <w:r>
+        <w:rPr>
+          <w:rFonts w:ascii="Courier New" w:hAnsi="Courier New" w:cs="Courier New"/>
+          <w:sz w:val="22"/>
+          <w:szCs w:val="22"/>
+        </w:rPr>
+        <w:t xml:space="preserve">gaat </w:t>
+      </w:r>
+      <w:r>
+        <w:rPr>
+          <w:rFonts w:ascii="Courier New" w:hAnsi="Courier New" w:cs="Courier New"/>
+          <w:sz w:val="22"/>
+          <w:szCs w:val="22"/>
+        </w:rPr>
+        <w:t xml:space="preserve">en </w:t>
+      </w:r>
+      <w:r>
+        <w:rPr>
+          <w:rFonts w:ascii="Courier New" w:hAnsi="Courier New" w:cs="Courier New"/>
+          <w:sz w:val="22"/>
+          <w:szCs w:val="22"/>
+        </w:rPr>
+        <w:t>die</w:t>
+      </w:r>
+      <w:r>
+        <w:rPr>
+          <w:rFonts w:ascii="Courier New" w:hAnsi="Courier New" w:cs="Courier New"/>
+          <w:sz w:val="22"/>
+          <w:szCs w:val="22"/>
+        </w:rPr>
+        <w:t xml:space="preserve"> respect voor het publiek uitstralen. </w:t>
+      </w:r>
+      <w:r>
+        <w:rPr>
+          <w:rFonts w:ascii="Courier New" w:hAnsi="Courier New" w:cs="Courier New"/>
+          <w:sz w:val="22"/>
+          <w:szCs w:val="22"/>
+        </w:rPr>
+        <w:t xml:space="preserve">Voor deliberatieve democratie </w:t>
+      </w:r>
+      <w:r>
+        <w:rPr>
+          <w:rFonts w:ascii="Courier New" w:hAnsi="Courier New" w:cs="Courier New"/>
+          <w:sz w:val="22"/>
+          <w:szCs w:val="22"/>
+        </w:rPr>
+        <w:t xml:space="preserve">is het </w:t>
+      </w:r>
+      <w:r>
+        <w:rPr>
+          <w:rFonts w:ascii="Courier New" w:hAnsi="Courier New" w:cs="Courier New"/>
+          <w:sz w:val="22"/>
+          <w:szCs w:val="22"/>
+        </w:rPr>
+        <w:t xml:space="preserve">ook </w:t>
+      </w:r>
+      <w:r>
+        <w:rPr>
+          <w:rFonts w:ascii="Courier New" w:hAnsi="Courier New" w:cs="Courier New"/>
+          <w:sz w:val="22"/>
+          <w:szCs w:val="22"/>
+        </w:rPr>
+        <w:t xml:space="preserve">belangrijk </w:t>
+      </w:r>
+      <w:r>
+        <w:rPr>
+          <w:rFonts w:ascii="Courier New" w:hAnsi="Courier New" w:cs="Courier New"/>
+          <w:sz w:val="22"/>
+          <w:szCs w:val="22"/>
+        </w:rPr>
+        <w:t>dat</w:t>
+      </w:r>
+      <w:r>
+        <w:rPr>
+          <w:rFonts w:ascii="Courier New" w:hAnsi="Courier New" w:cs="Courier New"/>
+          <w:sz w:val="22"/>
+          <w:szCs w:val="22"/>
+        </w:rPr>
+        <w:t xml:space="preserve"> de monopolie van </w:t>
+      </w:r>
+      <w:r>
+        <w:rPr>
+          <w:rFonts w:ascii="Courier New" w:hAnsi="Courier New" w:cs="Courier New"/>
+          <w:sz w:val="22"/>
+          <w:szCs w:val="22"/>
+        </w:rPr>
+        <w:t xml:space="preserve">een kleine selecte groep op de media wordt </w:t>
+      </w:r>
+      <w:r>
+        <w:rPr>
+          <w:rFonts w:ascii="Courier New" w:hAnsi="Courier New" w:cs="Courier New"/>
+          <w:sz w:val="22"/>
+          <w:szCs w:val="22"/>
+        </w:rPr>
+        <w:t>doorbr</w:t>
+      </w:r>
+      <w:r>
+        <w:rPr>
+          <w:rFonts w:ascii="Courier New" w:hAnsi="Courier New" w:cs="Courier New"/>
+          <w:sz w:val="22"/>
+          <w:szCs w:val="22"/>
+        </w:rPr>
+        <w:t>o</w:t>
+      </w:r>
+      <w:r>
+        <w:rPr>
+          <w:rFonts w:ascii="Courier New" w:hAnsi="Courier New" w:cs="Courier New"/>
+          <w:sz w:val="22"/>
+          <w:szCs w:val="22"/>
+        </w:rPr>
+        <w:t xml:space="preserve">ken, </w:t>
+      </w:r>
+      <w:r>
+        <w:rPr>
+          <w:rFonts w:ascii="Courier New" w:hAnsi="Courier New" w:cs="Courier New"/>
+          <w:sz w:val="22"/>
+          <w:szCs w:val="22"/>
+        </w:rPr>
+        <w:t>er wordt geïnvesteerd</w:t>
+      </w:r>
+      <w:r>
+        <w:rPr>
+          <w:rFonts w:ascii="Courier New" w:hAnsi="Courier New" w:cs="Courier New"/>
+          <w:sz w:val="22"/>
+          <w:szCs w:val="22"/>
+        </w:rPr>
+        <w:t xml:space="preserve"> in publieke ruimtes (zeker met lokaal nieuws) en gebruikers </w:t>
+      </w:r>
+      <w:r>
+        <w:rPr>
+          <w:rFonts w:ascii="Courier New" w:hAnsi="Courier New" w:cs="Courier New"/>
+          <w:sz w:val="22"/>
+          <w:szCs w:val="22"/>
+        </w:rPr>
+        <w:t>worden</w:t>
+      </w:r>
+      <w:r>
+        <w:rPr>
+          <w:rFonts w:ascii="Courier New" w:hAnsi="Courier New" w:cs="Courier New"/>
+          <w:sz w:val="22"/>
+          <w:szCs w:val="22"/>
+        </w:rPr>
+        <w:t xml:space="preserve"> bescherm</w:t>
+      </w:r>
+      <w:r>
+        <w:rPr>
+          <w:rFonts w:ascii="Courier New" w:hAnsi="Courier New" w:cs="Courier New"/>
+          <w:sz w:val="22"/>
+          <w:szCs w:val="22"/>
+        </w:rPr>
+        <w:t>d</w:t>
+      </w:r>
+      <w:r>
+        <w:rPr>
+          <w:rFonts w:ascii="Courier New" w:hAnsi="Courier New" w:cs="Courier New"/>
+          <w:sz w:val="22"/>
+          <w:szCs w:val="22"/>
+        </w:rPr>
+        <w:t>. Z</w:t>
+      </w:r>
+      <w:r>
+        <w:rPr>
+          <w:rFonts w:ascii="Courier New" w:hAnsi="Courier New" w:cs="Courier New"/>
+          <w:sz w:val="22"/>
+          <w:szCs w:val="22"/>
+        </w:rPr>
+        <w:t xml:space="preserve">oals dat </w:t>
+      </w:r>
+      <w:r>
+        <w:rPr>
+          <w:rFonts w:ascii="Courier New" w:hAnsi="Courier New" w:cs="Courier New"/>
+          <w:sz w:val="22"/>
+          <w:szCs w:val="22"/>
+        </w:rPr>
+        <w:t xml:space="preserve">ook </w:t>
+      </w:r>
+      <w:r>
+        <w:rPr>
+          <w:rFonts w:ascii="Courier New" w:hAnsi="Courier New" w:cs="Courier New"/>
+          <w:sz w:val="22"/>
+          <w:szCs w:val="22"/>
+        </w:rPr>
+        <w:t>bij</w:t>
+      </w:r>
+      <w:r>
+        <w:rPr>
+          <w:rFonts w:ascii="Courier New" w:hAnsi="Courier New" w:cs="Courier New"/>
+          <w:sz w:val="22"/>
+          <w:szCs w:val="22"/>
+        </w:rPr>
+        <w:t xml:space="preserve"> andere infrastructuren heel normaal is. Een goed functionerende democratie is geen luxe.</w:t>
+      </w:r>
+      <w:r>
+        <w:rPr>
+          <w:rFonts w:ascii="Courier New" w:hAnsi="Courier New" w:cs="Courier New"/>
+          <w:sz w:val="22"/>
+          <w:szCs w:val="22"/>
+        </w:rPr>
+        <w:t xml:space="preserve"> Democratie heeft een </w:t>
+      </w:r>
+      <w:r>
+        <w:rPr>
+          <w:rFonts w:ascii="Courier New" w:hAnsi="Courier New" w:cs="Courier New"/>
+          <w:sz w:val="22"/>
+          <w:szCs w:val="22"/>
+        </w:rPr>
+        <w:t>go</w:t>
+      </w:r>
+      <w:r>
+        <w:rPr>
+          <w:rFonts w:ascii="Courier New" w:hAnsi="Courier New" w:cs="Courier New"/>
+          <w:sz w:val="22"/>
+          <w:szCs w:val="22"/>
+        </w:rPr>
+        <w:t>e</w:t>
+      </w:r>
+      <w:r>
+        <w:rPr>
+          <w:rFonts w:ascii="Courier New" w:hAnsi="Courier New" w:cs="Courier New"/>
+          <w:sz w:val="22"/>
+          <w:szCs w:val="22"/>
+        </w:rPr>
+        <w:t>de</w:t>
+      </w:r>
+      <w:r>
+        <w:rPr>
+          <w:rFonts w:ascii="Courier New" w:hAnsi="Courier New" w:cs="Courier New"/>
+          <w:sz w:val="22"/>
+          <w:szCs w:val="22"/>
+        </w:rPr>
+        <w:t xml:space="preserve"> communicatie nodig tussen overheid, experts en burgers</w:t>
+      </w:r>
+      <w:r>
+        <w:rPr>
+          <w:rFonts w:ascii="Courier New" w:hAnsi="Courier New" w:cs="Courier New"/>
+          <w:sz w:val="22"/>
+          <w:szCs w:val="22"/>
+        </w:rPr>
+        <w:t xml:space="preserve">. Daarbij wordt, </w:t>
+      </w:r>
+      <w:r>
+        <w:rPr>
+          <w:rFonts w:ascii="Courier New" w:hAnsi="Courier New" w:cs="Courier New"/>
+          <w:sz w:val="22"/>
+          <w:szCs w:val="22"/>
+        </w:rPr>
+        <w:t xml:space="preserve">meer </w:t>
+      </w:r>
+      <w:r>
+        <w:rPr>
+          <w:rFonts w:ascii="Courier New" w:hAnsi="Courier New" w:cs="Courier New"/>
+          <w:sz w:val="22"/>
+          <w:szCs w:val="22"/>
+        </w:rPr>
+        <w:t>dan nu het geval is</w:t>
+      </w:r>
+      <w:r>
+        <w:rPr>
+          <w:rFonts w:ascii="Courier New" w:hAnsi="Courier New" w:cs="Courier New"/>
+          <w:sz w:val="22"/>
+          <w:szCs w:val="22"/>
+        </w:rPr>
+        <w:t>,</w:t>
       </w:r>
       <w:r>
         <w:rPr>
@@ -1670,280 +2343,15 @@
           <w:sz w:val="22"/>
           <w:szCs w:val="22"/>
         </w:rPr>
-        <w:t xml:space="preserve">ook </w:t>
-      </w:r>
-      <w:r>
-        <w:rPr>
-          <w:rFonts w:ascii="Courier New" w:hAnsi="Courier New" w:cs="Courier New"/>
-          <w:sz w:val="22"/>
-          <w:szCs w:val="22"/>
-        </w:rPr>
-        <w:t xml:space="preserve">veel </w:t>
-      </w:r>
-      <w:r>
-        <w:rPr>
-          <w:rFonts w:ascii="Courier New" w:hAnsi="Courier New" w:cs="Courier New"/>
-          <w:sz w:val="22"/>
-          <w:szCs w:val="22"/>
-        </w:rPr>
-        <w:t>op te steken</w:t>
-      </w:r>
-      <w:r>
-        <w:rPr>
-          <w:rFonts w:ascii="Courier New" w:hAnsi="Courier New" w:cs="Courier New"/>
-          <w:sz w:val="22"/>
-          <w:szCs w:val="22"/>
-        </w:rPr>
-        <w:t xml:space="preserve"> van</w:t>
-      </w:r>
-      <w:r>
-        <w:rPr>
-          <w:rFonts w:ascii="Courier New" w:hAnsi="Courier New" w:cs="Courier New"/>
-          <w:sz w:val="22"/>
-          <w:szCs w:val="22"/>
-        </w:rPr>
-        <w:t xml:space="preserve"> wetenschappers als</w:t>
-      </w:r>
-      <w:r>
-        <w:rPr>
-          <w:rFonts w:ascii="Courier New" w:hAnsi="Courier New" w:cs="Courier New"/>
-          <w:sz w:val="22"/>
-          <w:szCs w:val="22"/>
-        </w:rPr>
-        <w:t xml:space="preserve"> Rosling </w:t>
-      </w:r>
-      <w:r>
-        <w:rPr>
-          <w:rFonts w:ascii="Courier New" w:hAnsi="Courier New" w:cs="Courier New"/>
-          <w:sz w:val="22"/>
-          <w:szCs w:val="22"/>
-        </w:rPr>
-        <w:lastRenderedPageBreak/>
-        <w:t>(Zweden), Suzuki (Canada) en Nye (Amerika)</w:t>
-      </w:r>
-      <w:r>
-        <w:rPr>
-          <w:rFonts w:ascii="Courier New" w:hAnsi="Courier New" w:cs="Courier New"/>
-          <w:sz w:val="22"/>
-          <w:szCs w:val="22"/>
-        </w:rPr>
-        <w:t>, wetenschappers waarbij het</w:t>
-      </w:r>
-      <w:r>
-        <w:rPr>
-          <w:rFonts w:ascii="Courier New" w:hAnsi="Courier New" w:cs="Courier New"/>
-          <w:sz w:val="22"/>
-          <w:szCs w:val="22"/>
-        </w:rPr>
-        <w:t xml:space="preserve"> gaat</w:t>
-      </w:r>
-      <w:r>
-        <w:rPr>
-          <w:rFonts w:ascii="Courier New" w:hAnsi="Courier New" w:cs="Courier New"/>
-          <w:sz w:val="22"/>
-          <w:szCs w:val="22"/>
-        </w:rPr>
-        <w:t xml:space="preserve"> om de </w:t>
-      </w:r>
-      <w:r>
-        <w:rPr>
-          <w:rFonts w:ascii="Courier New" w:hAnsi="Courier New" w:cs="Courier New"/>
-          <w:sz w:val="22"/>
-          <w:szCs w:val="22"/>
-        </w:rPr>
-        <w:t xml:space="preserve">liefde van kennis en </w:t>
-      </w:r>
-      <w:r>
-        <w:rPr>
-          <w:rFonts w:ascii="Courier New" w:hAnsi="Courier New" w:cs="Courier New"/>
-          <w:sz w:val="22"/>
-          <w:szCs w:val="22"/>
-        </w:rPr>
-        <w:t>die</w:t>
-      </w:r>
-      <w:r>
-        <w:rPr>
-          <w:rFonts w:ascii="Courier New" w:hAnsi="Courier New" w:cs="Courier New"/>
-          <w:sz w:val="22"/>
-          <w:szCs w:val="22"/>
-        </w:rPr>
-        <w:t xml:space="preserve"> respect voor het publiek uitstralen. </w:t>
-      </w:r>
-      <w:r>
-        <w:rPr>
-          <w:rFonts w:ascii="Courier New" w:hAnsi="Courier New" w:cs="Courier New"/>
-          <w:sz w:val="22"/>
-          <w:szCs w:val="22"/>
-        </w:rPr>
-        <w:t xml:space="preserve">Voor deliberatieve democratie </w:t>
-      </w:r>
-      <w:r>
-        <w:rPr>
-          <w:rFonts w:ascii="Courier New" w:hAnsi="Courier New" w:cs="Courier New"/>
-          <w:sz w:val="22"/>
-          <w:szCs w:val="22"/>
-        </w:rPr>
-        <w:t xml:space="preserve">is het belangrijk </w:t>
-      </w:r>
-      <w:r>
-        <w:rPr>
-          <w:rFonts w:ascii="Courier New" w:hAnsi="Courier New" w:cs="Courier New"/>
-          <w:sz w:val="22"/>
-          <w:szCs w:val="22"/>
-        </w:rPr>
-        <w:t>als</w:t>
-      </w:r>
-      <w:r>
-        <w:rPr>
-          <w:rFonts w:ascii="Courier New" w:hAnsi="Courier New" w:cs="Courier New"/>
-          <w:sz w:val="22"/>
-          <w:szCs w:val="22"/>
-        </w:rPr>
-        <w:t xml:space="preserve"> de monopolie van </w:t>
-      </w:r>
-      <w:r>
-        <w:rPr>
-          <w:rFonts w:ascii="Courier New" w:hAnsi="Courier New" w:cs="Courier New"/>
-          <w:sz w:val="22"/>
-          <w:szCs w:val="22"/>
-        </w:rPr>
-        <w:t xml:space="preserve">een kleine selecte groep op de media wordt </w:t>
-      </w:r>
-      <w:r>
-        <w:rPr>
-          <w:rFonts w:ascii="Courier New" w:hAnsi="Courier New" w:cs="Courier New"/>
-          <w:sz w:val="22"/>
-          <w:szCs w:val="22"/>
-        </w:rPr>
-        <w:t>doorbr</w:t>
-      </w:r>
-      <w:r>
-        <w:rPr>
-          <w:rFonts w:ascii="Courier New" w:hAnsi="Courier New" w:cs="Courier New"/>
-          <w:sz w:val="22"/>
-          <w:szCs w:val="22"/>
-        </w:rPr>
-        <w:t>o</w:t>
-      </w:r>
-      <w:r>
-        <w:rPr>
-          <w:rFonts w:ascii="Courier New" w:hAnsi="Courier New" w:cs="Courier New"/>
-          <w:sz w:val="22"/>
-          <w:szCs w:val="22"/>
-        </w:rPr>
-        <w:t xml:space="preserve">ken, </w:t>
-      </w:r>
-      <w:r>
-        <w:rPr>
-          <w:rFonts w:ascii="Courier New" w:hAnsi="Courier New" w:cs="Courier New"/>
-          <w:sz w:val="22"/>
-          <w:szCs w:val="22"/>
-        </w:rPr>
-        <w:t>als er wordt geïnvesteerd</w:t>
-      </w:r>
-      <w:r>
-        <w:rPr>
-          <w:rFonts w:ascii="Courier New" w:hAnsi="Courier New" w:cs="Courier New"/>
-          <w:sz w:val="22"/>
-          <w:szCs w:val="22"/>
-        </w:rPr>
-        <w:t xml:space="preserve"> in publieke ruimtes (zeker met lokaal nieuws) en gebruikers </w:t>
-      </w:r>
-      <w:r>
-        <w:rPr>
-          <w:rFonts w:ascii="Courier New" w:hAnsi="Courier New" w:cs="Courier New"/>
-          <w:sz w:val="22"/>
-          <w:szCs w:val="22"/>
-        </w:rPr>
-        <w:t>worden</w:t>
-      </w:r>
-      <w:r>
-        <w:rPr>
-          <w:rFonts w:ascii="Courier New" w:hAnsi="Courier New" w:cs="Courier New"/>
-          <w:sz w:val="22"/>
-          <w:szCs w:val="22"/>
-        </w:rPr>
-        <w:t xml:space="preserve"> bescherm</w:t>
-      </w:r>
-      <w:r>
-        <w:rPr>
-          <w:rFonts w:ascii="Courier New" w:hAnsi="Courier New" w:cs="Courier New"/>
-          <w:sz w:val="22"/>
-          <w:szCs w:val="22"/>
-        </w:rPr>
-        <w:t>d,</w:t>
-      </w:r>
-      <w:r>
-        <w:rPr>
-          <w:rFonts w:ascii="Courier New" w:hAnsi="Courier New" w:cs="Courier New"/>
-          <w:sz w:val="22"/>
-          <w:szCs w:val="22"/>
-        </w:rPr>
-        <w:t xml:space="preserve"> zoals dat </w:t>
-      </w:r>
-      <w:r>
-        <w:rPr>
-          <w:rFonts w:ascii="Courier New" w:hAnsi="Courier New" w:cs="Courier New"/>
-          <w:sz w:val="22"/>
-          <w:szCs w:val="22"/>
-        </w:rPr>
-        <w:t xml:space="preserve">ook </w:t>
-      </w:r>
-      <w:r>
-        <w:rPr>
-          <w:rFonts w:ascii="Courier New" w:hAnsi="Courier New" w:cs="Courier New"/>
-          <w:sz w:val="22"/>
-          <w:szCs w:val="22"/>
-        </w:rPr>
-        <w:t>voor andere infrastructuren heel normaal is. Een goed functionerende democratie is geen luxe.</w:t>
-      </w:r>
-      <w:r>
-        <w:rPr>
-          <w:rFonts w:ascii="Courier New" w:hAnsi="Courier New" w:cs="Courier New"/>
-          <w:sz w:val="22"/>
-          <w:szCs w:val="22"/>
-        </w:rPr>
-        <w:t xml:space="preserve"> Democratie heeft een </w:t>
-      </w:r>
-      <w:r>
-        <w:rPr>
-          <w:rFonts w:ascii="Courier New" w:hAnsi="Courier New" w:cs="Courier New"/>
-          <w:sz w:val="22"/>
-          <w:szCs w:val="22"/>
-        </w:rPr>
-        <w:t>geode</w:t>
-      </w:r>
-      <w:r>
-        <w:rPr>
-          <w:rFonts w:ascii="Courier New" w:hAnsi="Courier New" w:cs="Courier New"/>
-          <w:sz w:val="22"/>
-          <w:szCs w:val="22"/>
-        </w:rPr>
-        <w:t xml:space="preserve"> communicatie nodig tussen overheid, experts en burgers, waarbij meer </w:t>
-      </w:r>
-      <w:r>
-        <w:rPr>
-          <w:rFonts w:ascii="Courier New" w:hAnsi="Courier New" w:cs="Courier New"/>
-          <w:sz w:val="22"/>
-          <w:szCs w:val="22"/>
-        </w:rPr>
-        <w:t xml:space="preserve">dan nu het geval is </w:t>
-      </w:r>
-      <w:r>
-        <w:rPr>
-          <w:rFonts w:ascii="Courier New" w:hAnsi="Courier New" w:cs="Courier New"/>
-          <w:sz w:val="22"/>
-          <w:szCs w:val="22"/>
-        </w:rPr>
-        <w:t xml:space="preserve">van burgers </w:t>
-      </w:r>
-      <w:r>
-        <w:rPr>
-          <w:rFonts w:ascii="Courier New" w:hAnsi="Courier New" w:cs="Courier New"/>
-          <w:sz w:val="22"/>
-          <w:szCs w:val="22"/>
-        </w:rPr>
-        <w:t xml:space="preserve">wordt </w:t>
+        <w:t>van burgers</w:t>
+      </w:r>
+      <w:r>
+        <w:rPr>
+          <w:rFonts w:ascii="Courier New" w:hAnsi="Courier New" w:cs="Courier New"/>
+          <w:sz w:val="22"/>
+          <w:szCs w:val="22"/>
+        </w:rPr>
+        <w:t xml:space="preserve"> </w:t>
       </w:r>
       <w:r>
         <w:rPr>
@@ -1959,6 +2367,14 @@
           <w:sz w:val="22"/>
           <w:szCs w:val="22"/>
         </w:rPr>
+        <w:t xml:space="preserve">krijgen </w:t>
+      </w:r>
+      <w:r>
+        <w:rPr>
+          <w:rFonts w:ascii="Courier New" w:hAnsi="Courier New" w:cs="Courier New"/>
+          <w:sz w:val="22"/>
+          <w:szCs w:val="22"/>
+        </w:rPr>
         <w:t>die burgers ook meer</w:t>
       </w:r>
       <w:r>
@@ -1967,7 +2383,23 @@
           <w:sz w:val="22"/>
           <w:szCs w:val="22"/>
         </w:rPr>
-        <w:t xml:space="preserve"> vertrouwen krijgen. De burgers kunnen hier zelf initiatief toe nemen</w:t>
+        <w:t xml:space="preserve"> vertrouwen. D</w:t>
+      </w:r>
+      <w:r>
+        <w:rPr>
+          <w:rFonts w:ascii="Courier New" w:hAnsi="Courier New" w:cs="Courier New"/>
+          <w:sz w:val="22"/>
+          <w:szCs w:val="22"/>
+        </w:rPr>
+        <w:t>i</w:t>
+      </w:r>
+      <w:r>
+        <w:rPr>
+          <w:rFonts w:ascii="Courier New" w:hAnsi="Courier New" w:cs="Courier New"/>
+          <w:sz w:val="22"/>
+          <w:szCs w:val="22"/>
+        </w:rPr>
+        <w:t>e burgers kunnen hier zelf initiatief toe nemen</w:t>
       </w:r>
       <w:r>
         <w:rPr>
@@ -2015,15 +2447,39 @@
           <w:sz w:val="22"/>
           <w:szCs w:val="22"/>
         </w:rPr>
-        <w:t xml:space="preserve"> met nucleaire wapens aan te tonen; de burgerinitiatieven in Canada om Syrische vluchtelingen op te vangen; het ‘stolperstein’-project in Duitsland om zichtbaar te maken waar Joden woonden voordat de Nazis kwamen. Ook </w:t>
-      </w:r>
-      <w:r>
-        <w:rPr>
-          <w:rFonts w:ascii="Courier New" w:hAnsi="Courier New" w:cs="Courier New"/>
-          <w:sz w:val="22"/>
-          <w:szCs w:val="22"/>
-        </w:rPr>
-        <w:t>kunnen er associaties gevormd worden om met elkaar te leren, betrokken te zijn te zijn en</w:t>
+        <w:t xml:space="preserve"> met nucleaire wapens aan te tonen; de burgerinitiatieven in Canada om Syrische vluchtelingen op te vangen; het ‘stolperstein’-project in Duitsland om zichtbaar te maken waar Joden woonden voordat de Nazis kwamen. </w:t>
+      </w:r>
+      <w:r>
+        <w:rPr>
+          <w:rFonts w:ascii="Courier New" w:hAnsi="Courier New" w:cs="Courier New"/>
+          <w:sz w:val="22"/>
+          <w:szCs w:val="22"/>
+        </w:rPr>
+        <w:t>Initiatieven vanuit de burgers zelf. Van bovenaf kunnen</w:t>
+      </w:r>
+      <w:r>
+        <w:rPr>
+          <w:rFonts w:ascii="Courier New" w:hAnsi="Courier New" w:cs="Courier New"/>
+          <w:sz w:val="22"/>
+          <w:szCs w:val="22"/>
+        </w:rPr>
+        <w:t xml:space="preserve"> associaties </w:t>
+      </w:r>
+      <w:r>
+        <w:rPr>
+          <w:rFonts w:ascii="Courier New" w:hAnsi="Courier New" w:cs="Courier New"/>
+          <w:sz w:val="22"/>
+          <w:szCs w:val="22"/>
+        </w:rPr>
+        <w:t xml:space="preserve">worden </w:t>
+      </w:r>
+      <w:r>
+        <w:rPr>
+          <w:rFonts w:ascii="Courier New" w:hAnsi="Courier New" w:cs="Courier New"/>
+          <w:sz w:val="22"/>
+          <w:szCs w:val="22"/>
+        </w:rPr>
+        <w:t>gevormd om met elkaar te leren, betrokken te zijn te zijn en</w:t>
       </w:r>
       <w:r>
         <w:rPr>
@@ -2063,15 +2519,23 @@
           <w:sz w:val="22"/>
           <w:szCs w:val="22"/>
         </w:rPr>
-        <w:t xml:space="preserve">dat gebeurt op </w:t>
-      </w:r>
-      <w:r>
-        <w:rPr>
-          <w:rFonts w:ascii="Courier New" w:hAnsi="Courier New" w:cs="Courier New"/>
-          <w:sz w:val="22"/>
-          <w:szCs w:val="22"/>
-        </w:rPr>
-        <w:t xml:space="preserve">de jaarlijkse Folkemødet in Denemarken, het land van de associaties, als meerdaags democratiefestival voor duizenden mensen; </w:t>
+        <w:t xml:space="preserve">dat gebeurt </w:t>
+      </w:r>
+      <w:r>
+        <w:rPr>
+          <w:rFonts w:ascii="Courier New" w:hAnsi="Courier New" w:cs="Courier New"/>
+          <w:sz w:val="22"/>
+          <w:szCs w:val="22"/>
+        </w:rPr>
+        <w:t>met al die associaties in Denemarken</w:t>
+      </w:r>
+      <w:r>
+        <w:rPr>
+          <w:rFonts w:ascii="Courier New" w:hAnsi="Courier New" w:cs="Courier New"/>
+          <w:sz w:val="22"/>
+          <w:szCs w:val="22"/>
+        </w:rPr>
+        <w:t xml:space="preserve">; </w:t>
       </w:r>
       <w:r>
         <w:rPr>
@@ -2119,7 +2583,23 @@
           <w:sz w:val="22"/>
           <w:szCs w:val="22"/>
         </w:rPr>
-        <w:t xml:space="preserve">et kunnen ook kleinere gemeenschapsinitiatieven zijn zoals de Community Conferencing Center in Baltimore </w:t>
+        <w:t xml:space="preserve">et kleinere gemeenschapsinitiatieven </w:t>
+      </w:r>
+      <w:r>
+        <w:rPr>
+          <w:rFonts w:ascii="Courier New" w:hAnsi="Courier New" w:cs="Courier New"/>
+          <w:sz w:val="22"/>
+          <w:szCs w:val="22"/>
+        </w:rPr>
+        <w:t>kunnen de deliberatieve democratie uitdrukken,</w:t>
+      </w:r>
+      <w:r>
+        <w:rPr>
+          <w:rFonts w:ascii="Courier New" w:hAnsi="Courier New" w:cs="Courier New"/>
+          <w:sz w:val="22"/>
+          <w:szCs w:val="22"/>
+        </w:rPr>
+        <w:t xml:space="preserve"> zoals de Community Conferencing Center in Baltimore </w:t>
       </w:r>
       <w:r>
         <w:rPr>
@@ -2159,7 +2639,39 @@
           <w:sz w:val="22"/>
           <w:szCs w:val="22"/>
         </w:rPr>
-        <w:t>. De volksvertegenwoordigingen, de festivals, de associaties en de coöperaties zijn vormen om een volgende stap in democratie te zetten</w:t>
+        <w:t>. De volksvertegenwoordigingen, de associaties</w:t>
+      </w:r>
+      <w:r>
+        <w:rPr>
+          <w:rFonts w:ascii="Courier New" w:hAnsi="Courier New" w:cs="Courier New"/>
+          <w:sz w:val="22"/>
+          <w:szCs w:val="22"/>
+        </w:rPr>
+        <w:t xml:space="preserve">, </w:t>
+      </w:r>
+      <w:r>
+        <w:rPr>
+          <w:rFonts w:ascii="Courier New" w:hAnsi="Courier New" w:cs="Courier New"/>
+          <w:sz w:val="22"/>
+          <w:szCs w:val="22"/>
+        </w:rPr>
+        <w:t xml:space="preserve">coöperaties </w:t>
+      </w:r>
+      <w:r>
+        <w:rPr>
+          <w:rFonts w:ascii="Courier New" w:hAnsi="Courier New" w:cs="Courier New"/>
+          <w:sz w:val="22"/>
+          <w:szCs w:val="22"/>
+        </w:rPr>
+        <w:t xml:space="preserve">en fesitivals om deze vorm van democratie te vieren </w:t>
+      </w:r>
+      <w:r>
+        <w:rPr>
+          <w:rFonts w:ascii="Courier New" w:hAnsi="Courier New" w:cs="Courier New"/>
+          <w:sz w:val="22"/>
+          <w:szCs w:val="22"/>
+        </w:rPr>
+        <w:t>zijn vormen om een volgende stap in democratie te zetten</w:t>
       </w:r>
       <w:r>
         <w:rPr>
@@ -2239,7 +2751,63 @@
           <w:sz w:val="22"/>
           <w:szCs w:val="22"/>
         </w:rPr>
-        <w:t xml:space="preserve">terug op een discussie die Lippmann en Dewey honderd jaar geleden met elkaar voerden. Lippmann was tijdens de Eerste Wereldoorlog adviseur van president Wilson en zag dat de publieke opinie een nieuwe vorm had gekregen. Mensen konden er door misleid worden en waren niet in staat om de politiek in al z’n complexiteit te volgen. Het was beter dit aan experts over </w:t>
+        <w:t>terug op een discussie die Lippmann en Dewey honderd jaar geleden met elkaar voerden</w:t>
+      </w:r>
+      <w:r>
+        <w:rPr>
+          <w:rFonts w:ascii="Courier New" w:hAnsi="Courier New" w:cs="Courier New"/>
+          <w:sz w:val="22"/>
+          <w:szCs w:val="22"/>
+        </w:rPr>
+        <w:t xml:space="preserve"> in Amerika</w:t>
+      </w:r>
+      <w:r>
+        <w:rPr>
+          <w:rFonts w:ascii="Courier New" w:hAnsi="Courier New" w:cs="Courier New"/>
+          <w:sz w:val="22"/>
+          <w:szCs w:val="22"/>
+        </w:rPr>
+        <w:t xml:space="preserve">. Lippmann was tijdens de Eerste Wereldoorlog adviseur van </w:t>
+      </w:r>
+      <w:r>
+        <w:rPr>
+          <w:rFonts w:ascii="Courier New" w:hAnsi="Courier New" w:cs="Courier New"/>
+          <w:sz w:val="22"/>
+          <w:szCs w:val="22"/>
+        </w:rPr>
+        <w:t xml:space="preserve">de Amerikaanse </w:t>
+      </w:r>
+      <w:r>
+        <w:rPr>
+          <w:rFonts w:ascii="Courier New" w:hAnsi="Courier New" w:cs="Courier New"/>
+          <w:sz w:val="22"/>
+          <w:szCs w:val="22"/>
+        </w:rPr>
+        <w:t xml:space="preserve">president Wilson en zag </w:t>
+      </w:r>
+      <w:r>
+        <w:rPr>
+          <w:rFonts w:ascii="Courier New" w:hAnsi="Courier New" w:cs="Courier New"/>
+          <w:sz w:val="22"/>
+          <w:szCs w:val="22"/>
+        </w:rPr>
+        <w:t xml:space="preserve">in die jaren </w:t>
+      </w:r>
+      <w:r>
+        <w:rPr>
+          <w:rFonts w:ascii="Courier New" w:hAnsi="Courier New" w:cs="Courier New"/>
+          <w:sz w:val="22"/>
+          <w:szCs w:val="22"/>
+        </w:rPr>
+        <w:t xml:space="preserve">dat de publieke opinie een nieuwe vorm had gekregen. </w:t>
+      </w:r>
+      <w:r>
+        <w:rPr>
+          <w:rFonts w:ascii="Courier New" w:hAnsi="Courier New" w:cs="Courier New"/>
+          <w:sz w:val="22"/>
+          <w:szCs w:val="22"/>
+        </w:rPr>
+        <w:t xml:space="preserve">Hij schreef er twee boeken </w:t>
       </w:r>
       <w:r>
         <w:rPr>
@@ -2248,7 +2816,183 @@
           <w:szCs w:val="22"/>
         </w:rPr>
         <w:lastRenderedPageBreak/>
-        <w:t xml:space="preserve">te laten, gewone mensen hun eigen ding konden doen en wel konden kiezen als het nodig was. </w:t>
+        <w:t xml:space="preserve">over. </w:t>
+      </w:r>
+      <w:r>
+        <w:rPr>
+          <w:rFonts w:ascii="Courier New" w:hAnsi="Courier New" w:cs="Courier New"/>
+          <w:sz w:val="22"/>
+          <w:szCs w:val="22"/>
+        </w:rPr>
+        <w:t xml:space="preserve">Mensen konden door </w:t>
+      </w:r>
+      <w:r>
+        <w:rPr>
+          <w:rFonts w:ascii="Courier New" w:hAnsi="Courier New" w:cs="Courier New"/>
+          <w:sz w:val="22"/>
+          <w:szCs w:val="22"/>
+        </w:rPr>
+        <w:t xml:space="preserve">de publieke opinie worden </w:t>
+      </w:r>
+      <w:r>
+        <w:rPr>
+          <w:rFonts w:ascii="Courier New" w:hAnsi="Courier New" w:cs="Courier New"/>
+          <w:sz w:val="22"/>
+          <w:szCs w:val="22"/>
+        </w:rPr>
+        <w:t xml:space="preserve">misleid en waren </w:t>
+      </w:r>
+      <w:r>
+        <w:rPr>
+          <w:rFonts w:ascii="Courier New" w:hAnsi="Courier New" w:cs="Courier New"/>
+          <w:sz w:val="22"/>
+          <w:szCs w:val="22"/>
+        </w:rPr>
+        <w:t xml:space="preserve">eigenlijk </w:t>
+      </w:r>
+      <w:r>
+        <w:rPr>
+          <w:rFonts w:ascii="Courier New" w:hAnsi="Courier New" w:cs="Courier New"/>
+          <w:sz w:val="22"/>
+          <w:szCs w:val="22"/>
+        </w:rPr>
+        <w:t xml:space="preserve">niet in staat om de politiek in al z’n complexiteit te volgen. </w:t>
+      </w:r>
+      <w:r>
+        <w:rPr>
+          <w:rFonts w:ascii="Courier New" w:hAnsi="Courier New" w:cs="Courier New"/>
+          <w:sz w:val="22"/>
+          <w:szCs w:val="22"/>
+        </w:rPr>
+        <w:t>Dat moesten we</w:t>
+      </w:r>
+      <w:r>
+        <w:rPr>
+          <w:rFonts w:ascii="Courier New" w:hAnsi="Courier New" w:cs="Courier New"/>
+          <w:sz w:val="22"/>
+          <w:szCs w:val="22"/>
+        </w:rPr>
+        <w:t>,</w:t>
+      </w:r>
+      <w:r>
+        <w:rPr>
+          <w:rFonts w:ascii="Courier New" w:hAnsi="Courier New" w:cs="Courier New"/>
+          <w:sz w:val="22"/>
+          <w:szCs w:val="22"/>
+        </w:rPr>
+        <w:t xml:space="preserve"> volgens </w:t>
+      </w:r>
+      <w:r>
+        <w:rPr>
+          <w:rFonts w:ascii="Courier New" w:hAnsi="Courier New" w:cs="Courier New"/>
+          <w:sz w:val="22"/>
+          <w:szCs w:val="22"/>
+        </w:rPr>
+        <w:t>Lippmann,</w:t>
+      </w:r>
+      <w:r>
+        <w:rPr>
+          <w:rFonts w:ascii="Courier New" w:hAnsi="Courier New" w:cs="Courier New"/>
+          <w:sz w:val="22"/>
+          <w:szCs w:val="22"/>
+        </w:rPr>
+        <w:t xml:space="preserve"> ook maar niet proberen. Beter</w:t>
+      </w:r>
+      <w:r>
+        <w:rPr>
+          <w:rFonts w:ascii="Courier New" w:hAnsi="Courier New" w:cs="Courier New"/>
+          <w:sz w:val="22"/>
+          <w:szCs w:val="22"/>
+        </w:rPr>
+        <w:t xml:space="preserve"> was </w:t>
+      </w:r>
+      <w:r>
+        <w:rPr>
+          <w:rFonts w:ascii="Courier New" w:hAnsi="Courier New" w:cs="Courier New"/>
+          <w:sz w:val="22"/>
+          <w:szCs w:val="22"/>
+        </w:rPr>
+        <w:t>het</w:t>
+      </w:r>
+      <w:r>
+        <w:rPr>
+          <w:rFonts w:ascii="Courier New" w:hAnsi="Courier New" w:cs="Courier New"/>
+          <w:sz w:val="22"/>
+          <w:szCs w:val="22"/>
+        </w:rPr>
+        <w:t xml:space="preserve"> dit aan experts over te laten</w:t>
+      </w:r>
+      <w:r>
+        <w:rPr>
+          <w:rFonts w:ascii="Courier New" w:hAnsi="Courier New" w:cs="Courier New"/>
+          <w:sz w:val="22"/>
+          <w:szCs w:val="22"/>
+        </w:rPr>
+        <w:t xml:space="preserve"> zodat</w:t>
+      </w:r>
+      <w:r>
+        <w:rPr>
+          <w:rFonts w:ascii="Courier New" w:hAnsi="Courier New" w:cs="Courier New"/>
+          <w:sz w:val="22"/>
+          <w:szCs w:val="22"/>
+        </w:rPr>
+        <w:t xml:space="preserve"> gewone mensen hun eigen ding </w:t>
+      </w:r>
+      <w:r>
+        <w:rPr>
+          <w:rFonts w:ascii="Courier New" w:hAnsi="Courier New" w:cs="Courier New"/>
+          <w:sz w:val="22"/>
+          <w:szCs w:val="22"/>
+        </w:rPr>
+        <w:t>k</w:t>
+      </w:r>
+      <w:r>
+        <w:rPr>
+          <w:rFonts w:ascii="Courier New" w:hAnsi="Courier New" w:cs="Courier New"/>
+          <w:sz w:val="22"/>
+          <w:szCs w:val="22"/>
+        </w:rPr>
+        <w:t>onden</w:t>
+      </w:r>
+      <w:r>
+        <w:rPr>
+          <w:rFonts w:ascii="Courier New" w:hAnsi="Courier New" w:cs="Courier New"/>
+          <w:sz w:val="22"/>
+          <w:szCs w:val="22"/>
+        </w:rPr>
+        <w:t xml:space="preserve"> </w:t>
+      </w:r>
+      <w:r>
+        <w:rPr>
+          <w:rFonts w:ascii="Courier New" w:hAnsi="Courier New" w:cs="Courier New"/>
+          <w:sz w:val="22"/>
+          <w:szCs w:val="22"/>
+        </w:rPr>
+        <w:t>doen</w:t>
+      </w:r>
+      <w:r>
+        <w:rPr>
+          <w:rFonts w:ascii="Courier New" w:hAnsi="Courier New" w:cs="Courier New"/>
+          <w:sz w:val="22"/>
+          <w:szCs w:val="22"/>
+        </w:rPr>
+        <w:t>, waaronder</w:t>
+      </w:r>
+      <w:r>
+        <w:rPr>
+          <w:rFonts w:ascii="Courier New" w:hAnsi="Courier New" w:cs="Courier New"/>
+          <w:sz w:val="22"/>
+          <w:szCs w:val="22"/>
+        </w:rPr>
+        <w:t xml:space="preserve"> democratisch</w:t>
+      </w:r>
+      <w:r>
+        <w:rPr>
+          <w:rFonts w:ascii="Courier New" w:hAnsi="Courier New" w:cs="Courier New"/>
+          <w:sz w:val="22"/>
+          <w:szCs w:val="22"/>
+        </w:rPr>
+        <w:t xml:space="preserve"> kiezen als het nodig was. </w:t>
       </w:r>
       <w:r>
         <w:rPr>
@@ -2264,7 +3008,23 @@
           <w:sz w:val="22"/>
           <w:szCs w:val="22"/>
         </w:rPr>
-        <w:t>Dewey wist dat het Lippmann ging om versterken van democratie</w:t>
+        <w:t xml:space="preserve">Dewey wist dat het Lippmann ging om </w:t>
+      </w:r>
+      <w:r>
+        <w:rPr>
+          <w:rFonts w:ascii="Courier New" w:hAnsi="Courier New" w:cs="Courier New"/>
+          <w:sz w:val="22"/>
+          <w:szCs w:val="22"/>
+        </w:rPr>
+        <w:t xml:space="preserve">het </w:t>
+      </w:r>
+      <w:r>
+        <w:rPr>
+          <w:rFonts w:ascii="Courier New" w:hAnsi="Courier New" w:cs="Courier New"/>
+          <w:sz w:val="22"/>
+          <w:szCs w:val="22"/>
+        </w:rPr>
+        <w:t>versterken van democratie</w:t>
       </w:r>
       <w:r>
         <w:rPr>
@@ -2288,7 +3048,23 @@
           <w:sz w:val="22"/>
           <w:szCs w:val="22"/>
         </w:rPr>
-        <w:t xml:space="preserve"> ging verder in zijn idee</w:t>
+        <w:t xml:space="preserve"> ging </w:t>
+      </w:r>
+      <w:r>
+        <w:rPr>
+          <w:rFonts w:ascii="Courier New" w:hAnsi="Courier New" w:cs="Courier New"/>
+          <w:sz w:val="22"/>
+          <w:szCs w:val="22"/>
+        </w:rPr>
+        <w:t xml:space="preserve">zelf </w:t>
+      </w:r>
+      <w:r>
+        <w:rPr>
+          <w:rFonts w:ascii="Courier New" w:hAnsi="Courier New" w:cs="Courier New"/>
+          <w:sz w:val="22"/>
+          <w:szCs w:val="22"/>
+        </w:rPr>
+        <w:t>verder in zijn idee</w:t>
       </w:r>
       <w:r>
         <w:rPr>
@@ -2328,47 +3104,455 @@
           <w:sz w:val="22"/>
           <w:szCs w:val="22"/>
         </w:rPr>
-        <w:t xml:space="preserve"> moet je naar de schoenmaker, </w:t>
-      </w:r>
-      <w:r>
-        <w:rPr>
-          <w:rFonts w:ascii="Courier New" w:hAnsi="Courier New" w:cs="Courier New"/>
-          <w:sz w:val="22"/>
-          <w:szCs w:val="22"/>
-        </w:rPr>
-        <w:t>zo schreef hij, alleen</w:t>
-      </w:r>
-      <w:r>
-        <w:rPr>
-          <w:rFonts w:ascii="Courier New" w:hAnsi="Courier New" w:cs="Courier New"/>
-          <w:sz w:val="22"/>
-          <w:szCs w:val="22"/>
-        </w:rPr>
-        <w:t xml:space="preserve"> jij als schoenendrager het beste uitleggen waar het precies in de schoen wringt. </w:t>
-      </w:r>
-      <w:r>
-        <w:rPr>
-          <w:rFonts w:ascii="Courier New" w:hAnsi="Courier New" w:cs="Courier New"/>
-          <w:sz w:val="22"/>
-          <w:szCs w:val="22"/>
-        </w:rPr>
-        <w:t xml:space="preserve">En zo is dat in een democratie ook. </w:t>
-      </w:r>
-      <w:r>
-        <w:rPr>
-          <w:rFonts w:ascii="Courier New" w:hAnsi="Courier New" w:cs="Courier New"/>
-          <w:sz w:val="22"/>
-          <w:szCs w:val="22"/>
-        </w:rPr>
-        <w:t xml:space="preserve">Lippmanns gedachten horen bij het eerste bedrijf van de democratie, Deweys ideeën horen bij het tweede bedrijf. Het eerste bedrijf met z’n politieke vertegenwoordiging, vrije pers, onafhankelijk juridisch systeem en stemrecht voor iedereen moet nog steeds verdedigd worden. Maar er zijn nieuwe problemen bij gekomen die vooral het publieke informatiesysteem raken met de nieuwe plaforms van sociale media, misinformatie en polarisatie die de democratie raken en die nieuwe antwoorden vragen. </w:t>
-      </w:r>
-      <w:r>
-        <w:rPr>
-          <w:rFonts w:ascii="Courier New" w:hAnsi="Courier New" w:cs="Courier New"/>
-          <w:sz w:val="22"/>
-          <w:szCs w:val="22"/>
-        </w:rPr>
-        <w:t>De nieuwe sociale situatie vraagt de invloed van meer mensen en van meer publieken om met elkaar te overleggen, beslissingen te nemen en problemen op te lossen en die de democratie sterker maken, gedeelder maken en levendiger maken. Hier ligt ook de opdracht van democratische instituten om publieken beter geinformeerd, betrokken en productiever te maken. En de politiek heeft de taak de representatie meer te delen en er voor te zorgen dat mensen er toe doen, gehoord worden en meetellen, niet op een populistische maar op een democratische manier.</w:t>
+        <w:t>, zo schreef hij in zijn eigen boek over dit onderwerp,</w:t>
+      </w:r>
+      <w:r>
+        <w:rPr>
+          <w:rFonts w:ascii="Courier New" w:hAnsi="Courier New" w:cs="Courier New"/>
+          <w:sz w:val="22"/>
+          <w:szCs w:val="22"/>
+        </w:rPr>
+        <w:t xml:space="preserve"> </w:t>
+      </w:r>
+      <w:r>
+        <w:rPr>
+          <w:rFonts w:ascii="Courier New" w:hAnsi="Courier New" w:cs="Courier New"/>
+          <w:sz w:val="22"/>
+          <w:szCs w:val="22"/>
+        </w:rPr>
+        <w:t>ga</w:t>
+      </w:r>
+      <w:r>
+        <w:rPr>
+          <w:rFonts w:ascii="Courier New" w:hAnsi="Courier New" w:cs="Courier New"/>
+          <w:sz w:val="22"/>
+          <w:szCs w:val="22"/>
+        </w:rPr>
+        <w:t xml:space="preserve"> je naar de schoenmaker</w:t>
+      </w:r>
+      <w:r>
+        <w:rPr>
+          <w:rFonts w:ascii="Courier New" w:hAnsi="Courier New" w:cs="Courier New"/>
+          <w:sz w:val="22"/>
+          <w:szCs w:val="22"/>
+        </w:rPr>
+        <w:t xml:space="preserve">. Maar </w:t>
+      </w:r>
+      <w:r>
+        <w:rPr>
+          <w:rFonts w:ascii="Courier New" w:hAnsi="Courier New" w:cs="Courier New"/>
+          <w:sz w:val="22"/>
+          <w:szCs w:val="22"/>
+        </w:rPr>
+        <w:t>alleen</w:t>
+      </w:r>
+      <w:r>
+        <w:rPr>
+          <w:rFonts w:ascii="Courier New" w:hAnsi="Courier New" w:cs="Courier New"/>
+          <w:sz w:val="22"/>
+          <w:szCs w:val="22"/>
+        </w:rPr>
+        <w:t xml:space="preserve"> jij</w:t>
+      </w:r>
+      <w:r>
+        <w:rPr>
+          <w:rFonts w:ascii="Courier New" w:hAnsi="Courier New" w:cs="Courier New"/>
+          <w:sz w:val="22"/>
+          <w:szCs w:val="22"/>
+        </w:rPr>
+        <w:t xml:space="preserve">, </w:t>
+      </w:r>
+      <w:r>
+        <w:rPr>
+          <w:rFonts w:ascii="Courier New" w:hAnsi="Courier New" w:cs="Courier New"/>
+          <w:sz w:val="22"/>
+          <w:szCs w:val="22"/>
+        </w:rPr>
+        <w:t>schoenendrager</w:t>
+      </w:r>
+      <w:r>
+        <w:rPr>
+          <w:rFonts w:ascii="Courier New" w:hAnsi="Courier New" w:cs="Courier New"/>
+          <w:sz w:val="22"/>
+          <w:szCs w:val="22"/>
+        </w:rPr>
+        <w:t>,</w:t>
+      </w:r>
+      <w:r>
+        <w:rPr>
+          <w:rFonts w:ascii="Courier New" w:hAnsi="Courier New" w:cs="Courier New"/>
+          <w:sz w:val="22"/>
+          <w:szCs w:val="22"/>
+        </w:rPr>
+        <w:t xml:space="preserve"> </w:t>
+      </w:r>
+      <w:r>
+        <w:rPr>
+          <w:rFonts w:ascii="Courier New" w:hAnsi="Courier New" w:cs="Courier New"/>
+          <w:sz w:val="22"/>
+          <w:szCs w:val="22"/>
+        </w:rPr>
+        <w:t xml:space="preserve">kunt </w:t>
+      </w:r>
+      <w:r>
+        <w:rPr>
+          <w:rFonts w:ascii="Courier New" w:hAnsi="Courier New" w:cs="Courier New"/>
+          <w:sz w:val="22"/>
+          <w:szCs w:val="22"/>
+        </w:rPr>
+        <w:t xml:space="preserve">het beste uitleggen waar het precies in de schoen </w:t>
+      </w:r>
+      <w:r>
+        <w:rPr>
+          <w:rFonts w:ascii="Courier New" w:hAnsi="Courier New" w:cs="Courier New"/>
+          <w:sz w:val="22"/>
+          <w:szCs w:val="22"/>
+        </w:rPr>
+        <w:t>knelt</w:t>
+      </w:r>
+      <w:r>
+        <w:rPr>
+          <w:rFonts w:ascii="Courier New" w:hAnsi="Courier New" w:cs="Courier New"/>
+          <w:sz w:val="22"/>
+          <w:szCs w:val="22"/>
+        </w:rPr>
+        <w:t xml:space="preserve">. </w:t>
+      </w:r>
+      <w:r>
+        <w:rPr>
+          <w:rFonts w:ascii="Courier New" w:hAnsi="Courier New" w:cs="Courier New"/>
+          <w:sz w:val="22"/>
+          <w:szCs w:val="22"/>
+        </w:rPr>
+        <w:t xml:space="preserve">En zo is dat in een democratie </w:t>
+      </w:r>
+      <w:r>
+        <w:rPr>
+          <w:rFonts w:ascii="Courier New" w:hAnsi="Courier New" w:cs="Courier New"/>
+          <w:sz w:val="22"/>
+          <w:szCs w:val="22"/>
+        </w:rPr>
+        <w:t xml:space="preserve">eigenlijk </w:t>
+      </w:r>
+      <w:r>
+        <w:rPr>
+          <w:rFonts w:ascii="Courier New" w:hAnsi="Courier New" w:cs="Courier New"/>
+          <w:sz w:val="22"/>
+          <w:szCs w:val="22"/>
+        </w:rPr>
+        <w:t>ook.</w:t>
+      </w:r>
+      <w:r>
+        <w:rPr>
+          <w:rFonts w:ascii="Courier New" w:hAnsi="Courier New" w:cs="Courier New"/>
+          <w:sz w:val="22"/>
+          <w:szCs w:val="22"/>
+        </w:rPr>
+        <w:t xml:space="preserve"> Voor het oplossen van problemen zijn </w:t>
+      </w:r>
+      <w:r>
+        <w:rPr>
+          <w:rFonts w:ascii="Courier New" w:hAnsi="Courier New" w:cs="Courier New"/>
+          <w:sz w:val="22"/>
+          <w:szCs w:val="22"/>
+        </w:rPr>
+        <w:t xml:space="preserve">naast vertegenwoordigers en experts </w:t>
+      </w:r>
+      <w:r>
+        <w:rPr>
+          <w:rFonts w:ascii="Courier New" w:hAnsi="Courier New" w:cs="Courier New"/>
+          <w:sz w:val="22"/>
+          <w:szCs w:val="22"/>
+        </w:rPr>
+        <w:t>ook gewone mensen nodig.</w:t>
+      </w:r>
+      <w:r>
+        <w:rPr>
+          <w:rFonts w:ascii="Courier New" w:hAnsi="Courier New" w:cs="Courier New"/>
+          <w:sz w:val="22"/>
+          <w:szCs w:val="22"/>
+        </w:rPr>
+        <w:t xml:space="preserve"> </w:t>
+      </w:r>
+      <w:r>
+        <w:rPr>
+          <w:rFonts w:ascii="Courier New" w:hAnsi="Courier New" w:cs="Courier New"/>
+          <w:sz w:val="22"/>
+          <w:szCs w:val="22"/>
+        </w:rPr>
+        <w:t xml:space="preserve">Lippmanns gedachten horen bij het </w:t>
+      </w:r>
+      <w:r>
+        <w:rPr>
+          <w:rFonts w:ascii="Courier New" w:hAnsi="Courier New" w:cs="Courier New"/>
+          <w:sz w:val="22"/>
+          <w:szCs w:val="22"/>
+        </w:rPr>
+        <w:t xml:space="preserve">klassieke </w:t>
+      </w:r>
+      <w:r>
+        <w:rPr>
+          <w:rFonts w:ascii="Courier New" w:hAnsi="Courier New" w:cs="Courier New"/>
+          <w:sz w:val="22"/>
+          <w:szCs w:val="22"/>
+        </w:rPr>
+        <w:t xml:space="preserve">eerste bedrijf van de democratie, Deweys ideeën horen bij het </w:t>
+      </w:r>
+      <w:r>
+        <w:rPr>
+          <w:rFonts w:ascii="Courier New" w:hAnsi="Courier New" w:cs="Courier New"/>
+          <w:sz w:val="22"/>
+          <w:szCs w:val="22"/>
+        </w:rPr>
+        <w:t xml:space="preserve">nieuwe </w:t>
+      </w:r>
+      <w:r>
+        <w:rPr>
+          <w:rFonts w:ascii="Courier New" w:hAnsi="Courier New" w:cs="Courier New"/>
+          <w:sz w:val="22"/>
+          <w:szCs w:val="22"/>
+        </w:rPr>
+        <w:t xml:space="preserve">tweede bedrijf. Het eerste bedrijf met z’n politieke vertegenwoordiging, vrije pers, onafhankelijk juridisch systeem en stemrecht voor iedereen moet nog steeds verdedigd worden. </w:t>
+      </w:r>
+      <w:r>
+        <w:rPr>
+          <w:rFonts w:ascii="Courier New" w:hAnsi="Courier New" w:cs="Courier New"/>
+          <w:sz w:val="22"/>
+          <w:szCs w:val="22"/>
+        </w:rPr>
+        <w:t xml:space="preserve">Dat is wel duidelijk geworden de laatste jaren. </w:t>
+      </w:r>
+      <w:r>
+        <w:rPr>
+          <w:rFonts w:ascii="Courier New" w:hAnsi="Courier New" w:cs="Courier New"/>
+          <w:sz w:val="22"/>
+          <w:szCs w:val="22"/>
+        </w:rPr>
+        <w:t xml:space="preserve">Maar </w:t>
+      </w:r>
+      <w:r>
+        <w:rPr>
+          <w:rFonts w:ascii="Courier New" w:hAnsi="Courier New" w:cs="Courier New"/>
+          <w:sz w:val="22"/>
+          <w:szCs w:val="22"/>
+        </w:rPr>
+        <w:t>in die periode</w:t>
+      </w:r>
+      <w:r>
+        <w:rPr>
+          <w:rFonts w:ascii="Courier New" w:hAnsi="Courier New" w:cs="Courier New"/>
+          <w:sz w:val="22"/>
+          <w:szCs w:val="22"/>
+        </w:rPr>
+        <w:t xml:space="preserve"> zijn </w:t>
+      </w:r>
+      <w:r>
+        <w:rPr>
+          <w:rFonts w:ascii="Courier New" w:hAnsi="Courier New" w:cs="Courier New"/>
+          <w:sz w:val="22"/>
+          <w:szCs w:val="22"/>
+        </w:rPr>
+        <w:t xml:space="preserve">er ook </w:t>
+      </w:r>
+      <w:r>
+        <w:rPr>
+          <w:rFonts w:ascii="Courier New" w:hAnsi="Courier New" w:cs="Courier New"/>
+          <w:sz w:val="22"/>
+          <w:szCs w:val="22"/>
+        </w:rPr>
+        <w:t>nieuwe problemen bij gekomen</w:t>
+      </w:r>
+      <w:r>
+        <w:rPr>
+          <w:rFonts w:ascii="Courier New" w:hAnsi="Courier New" w:cs="Courier New"/>
+          <w:sz w:val="22"/>
+          <w:szCs w:val="22"/>
+        </w:rPr>
+        <w:t>. D</w:t>
+      </w:r>
+      <w:r>
+        <w:rPr>
+          <w:rFonts w:ascii="Courier New" w:hAnsi="Courier New" w:cs="Courier New"/>
+          <w:sz w:val="22"/>
+          <w:szCs w:val="22"/>
+        </w:rPr>
+        <w:t xml:space="preserve">ie </w:t>
+      </w:r>
+      <w:r>
+        <w:rPr>
+          <w:rFonts w:ascii="Courier New" w:hAnsi="Courier New" w:cs="Courier New"/>
+          <w:sz w:val="22"/>
+          <w:szCs w:val="22"/>
+        </w:rPr>
+        <w:t xml:space="preserve">raken </w:t>
+      </w:r>
+      <w:r>
+        <w:rPr>
+          <w:rFonts w:ascii="Courier New" w:hAnsi="Courier New" w:cs="Courier New"/>
+          <w:sz w:val="22"/>
+          <w:szCs w:val="22"/>
+        </w:rPr>
+        <w:t>vooral het publieke informatiesysteem met de nieuwe plaforms van sociale media, misinformatie en polarisatie</w:t>
+      </w:r>
+      <w:r>
+        <w:rPr>
+          <w:rFonts w:ascii="Courier New" w:hAnsi="Courier New" w:cs="Courier New"/>
+          <w:sz w:val="22"/>
+          <w:szCs w:val="22"/>
+        </w:rPr>
+        <w:t xml:space="preserve">. Die problemen vragen </w:t>
+      </w:r>
+      <w:r>
+        <w:rPr>
+          <w:rFonts w:ascii="Courier New" w:hAnsi="Courier New" w:cs="Courier New"/>
+          <w:sz w:val="22"/>
+          <w:szCs w:val="22"/>
+        </w:rPr>
+        <w:t>nieuwe antwoorden</w:t>
+      </w:r>
+      <w:r>
+        <w:rPr>
+          <w:rFonts w:ascii="Courier New" w:hAnsi="Courier New" w:cs="Courier New"/>
+          <w:sz w:val="22"/>
+          <w:szCs w:val="22"/>
+        </w:rPr>
+        <w:t>, zoals de hele</w:t>
+      </w:r>
+      <w:r>
+        <w:rPr>
+          <w:rFonts w:ascii="Courier New" w:hAnsi="Courier New" w:cs="Courier New"/>
+          <w:sz w:val="22"/>
+          <w:szCs w:val="22"/>
+        </w:rPr>
+        <w:t xml:space="preserve"> nieuwe sociale situatie </w:t>
+      </w:r>
+      <w:r>
+        <w:rPr>
+          <w:rFonts w:ascii="Courier New" w:hAnsi="Courier New" w:cs="Courier New"/>
+          <w:sz w:val="22"/>
+          <w:szCs w:val="22"/>
+        </w:rPr>
+        <w:t xml:space="preserve">om </w:t>
+      </w:r>
+      <w:r>
+        <w:rPr>
+          <w:rFonts w:ascii="Courier New" w:hAnsi="Courier New" w:cs="Courier New"/>
+          <w:sz w:val="22"/>
+          <w:szCs w:val="22"/>
+        </w:rPr>
+        <w:t xml:space="preserve">invloed van meer mensen </w:t>
+      </w:r>
+      <w:r>
+        <w:rPr>
+          <w:rFonts w:ascii="Courier New" w:hAnsi="Courier New" w:cs="Courier New"/>
+          <w:sz w:val="22"/>
+          <w:szCs w:val="22"/>
+        </w:rPr>
+        <w:t>vraagt. Het vraagt</w:t>
+      </w:r>
+      <w:r>
+        <w:rPr>
+          <w:rFonts w:ascii="Courier New" w:hAnsi="Courier New" w:cs="Courier New"/>
+          <w:sz w:val="22"/>
+          <w:szCs w:val="22"/>
+        </w:rPr>
+        <w:t xml:space="preserve"> meer publieken om met elkaar te overleggen, beslissingen te nemen en problemen op te lossen</w:t>
+      </w:r>
+      <w:r>
+        <w:rPr>
+          <w:rFonts w:ascii="Courier New" w:hAnsi="Courier New" w:cs="Courier New"/>
+          <w:sz w:val="22"/>
+          <w:szCs w:val="22"/>
+        </w:rPr>
+        <w:t>. Di</w:t>
+      </w:r>
+      <w:r>
+        <w:rPr>
+          <w:rFonts w:ascii="Courier New" w:hAnsi="Courier New" w:cs="Courier New"/>
+          <w:sz w:val="22"/>
+          <w:szCs w:val="22"/>
+        </w:rPr>
+        <w:t>t</w:t>
+      </w:r>
+      <w:r>
+        <w:rPr>
+          <w:rFonts w:ascii="Courier New" w:hAnsi="Courier New" w:cs="Courier New"/>
+          <w:sz w:val="22"/>
+          <w:szCs w:val="22"/>
+        </w:rPr>
+        <w:t xml:space="preserve"> za</w:t>
+      </w:r>
+      <w:r>
+        <w:rPr>
+          <w:rFonts w:ascii="Courier New" w:hAnsi="Courier New" w:cs="Courier New"/>
+          <w:sz w:val="22"/>
+          <w:szCs w:val="22"/>
+        </w:rPr>
+        <w:t>l</w:t>
+      </w:r>
+      <w:r>
+        <w:rPr>
+          <w:rFonts w:ascii="Courier New" w:hAnsi="Courier New" w:cs="Courier New"/>
+          <w:sz w:val="22"/>
+          <w:szCs w:val="22"/>
+        </w:rPr>
+        <w:t xml:space="preserve"> </w:t>
+      </w:r>
+      <w:r>
+        <w:rPr>
+          <w:rFonts w:ascii="Courier New" w:hAnsi="Courier New" w:cs="Courier New"/>
+          <w:sz w:val="22"/>
+          <w:szCs w:val="22"/>
+        </w:rPr>
+        <w:t>de democratie sterker, gedeelder en levendiger maken. Hier ligt ook de opdracht v</w:t>
+      </w:r>
+      <w:r>
+        <w:rPr>
+          <w:rFonts w:ascii="Courier New" w:hAnsi="Courier New" w:cs="Courier New"/>
+          <w:sz w:val="22"/>
+          <w:szCs w:val="22"/>
+        </w:rPr>
+        <w:t>oor</w:t>
+      </w:r>
+      <w:r>
+        <w:rPr>
+          <w:rFonts w:ascii="Courier New" w:hAnsi="Courier New" w:cs="Courier New"/>
+          <w:sz w:val="22"/>
+          <w:szCs w:val="22"/>
+        </w:rPr>
+        <w:t xml:space="preserve"> democratische instituten om publieken beter geinformeerd, betrokken en productiever te maken. En de politiek heeft de taak de representatie meer te delen en er voor te zorgen dat mensen er toe doen, gehoord worden en meetellen</w:t>
+      </w:r>
+      <w:r>
+        <w:rPr>
+          <w:rFonts w:ascii="Courier New" w:hAnsi="Courier New" w:cs="Courier New"/>
+          <w:sz w:val="22"/>
+          <w:szCs w:val="22"/>
+        </w:rPr>
+        <w:t>. N</w:t>
+      </w:r>
+      <w:r>
+        <w:rPr>
+          <w:rFonts w:ascii="Courier New" w:hAnsi="Courier New" w:cs="Courier New"/>
+          <w:sz w:val="22"/>
+          <w:szCs w:val="22"/>
+        </w:rPr>
+        <w:t>iet op een populistische</w:t>
+      </w:r>
+      <w:r>
+        <w:rPr>
+          <w:rFonts w:ascii="Courier New" w:hAnsi="Courier New" w:cs="Courier New"/>
+          <w:sz w:val="22"/>
+          <w:szCs w:val="22"/>
+        </w:rPr>
+        <w:t>,</w:t>
+      </w:r>
+      <w:r>
+        <w:rPr>
+          <w:rFonts w:ascii="Courier New" w:hAnsi="Courier New" w:cs="Courier New"/>
+          <w:sz w:val="22"/>
+          <w:szCs w:val="22"/>
+        </w:rPr>
+        <w:t xml:space="preserve"> maar op een democratische manier.</w:t>
       </w:r>
     </w:p>
     <w:p>
@@ -2380,6 +3564,115 @@
           <w:szCs w:val="22"/>
         </w:rPr>
       </w:pPr>
+      <w:r>
+        <w:rPr>
+          <w:rFonts w:ascii="Courier New" w:hAnsi="Courier New" w:cs="Courier New"/>
+          <w:sz w:val="22"/>
+          <w:szCs w:val="22"/>
+        </w:rPr>
+        <w:tab/>
+      </w:r>
+      <w:r>
+        <w:rPr>
+          <w:rFonts w:ascii="Courier New" w:hAnsi="Courier New" w:cs="Courier New"/>
+          <w:i/>
+          <w:iCs/>
+          <w:sz w:val="22"/>
+          <w:szCs w:val="22"/>
+        </w:rPr>
+        <w:t>Democracy’s second act: why politics needs the public</w:t>
+      </w:r>
+      <w:r>
+        <w:rPr>
+          <w:rFonts w:ascii="Courier New" w:hAnsi="Courier New" w:cs="Courier New"/>
+          <w:i/>
+          <w:iCs/>
+          <w:sz w:val="22"/>
+          <w:szCs w:val="22"/>
+        </w:rPr>
+        <w:t xml:space="preserve"> </w:t>
+      </w:r>
+      <w:r>
+        <w:rPr>
+          <w:rFonts w:ascii="Courier New" w:hAnsi="Courier New" w:cs="Courier New"/>
+          <w:sz w:val="22"/>
+          <w:szCs w:val="22"/>
+        </w:rPr>
+        <w:t xml:space="preserve">is een zeer uitdagend en inspirerend boek. Het is goed als democraten niet alleen maar in de verdediging zitten maar ook met nieuwe perspectieven komen waar mensen zich aan kunnen optrekken. Het democratisch potentieel is veel rijker dan we soms denken. In ieder geval bieden MacLeod en Johnson met hun boek veel stof om verder met </w:t>
+      </w:r>
+      <w:r>
+        <w:rPr>
+          <w:rFonts w:ascii="Courier New" w:hAnsi="Courier New" w:cs="Courier New"/>
+          <w:sz w:val="22"/>
+          <w:szCs w:val="22"/>
+        </w:rPr>
+        <w:lastRenderedPageBreak/>
+        <w:t xml:space="preserve">elkaar over na te denken en te spreken. Na het lezen blijf ik wel met de vraag zitten of deze vorm van </w:t>
+      </w:r>
+      <w:r>
+        <w:rPr>
+          <w:rFonts w:ascii="Courier New" w:hAnsi="Courier New" w:cs="Courier New"/>
+          <w:sz w:val="22"/>
+          <w:szCs w:val="22"/>
+        </w:rPr>
+        <w:t>‘</w:t>
+      </w:r>
+      <w:r>
+        <w:rPr>
+          <w:rFonts w:ascii="Courier New" w:hAnsi="Courier New" w:cs="Courier New"/>
+          <w:sz w:val="22"/>
+          <w:szCs w:val="22"/>
+        </w:rPr>
+        <w:t>democratie plus</w:t>
+      </w:r>
+      <w:r>
+        <w:rPr>
+          <w:rFonts w:ascii="Courier New" w:hAnsi="Courier New" w:cs="Courier New"/>
+          <w:sz w:val="22"/>
+          <w:szCs w:val="22"/>
+        </w:rPr>
+        <w:t>’</w:t>
+      </w:r>
+      <w:r>
+        <w:rPr>
+          <w:rFonts w:ascii="Courier New" w:hAnsi="Courier New" w:cs="Courier New"/>
+          <w:sz w:val="22"/>
+          <w:szCs w:val="22"/>
+        </w:rPr>
+        <w:t xml:space="preserve"> overal een antwoord op is. Of en hoe je dat doet voor wereldwijde problem</w:t>
+      </w:r>
+      <w:r>
+        <w:rPr>
+          <w:rFonts w:ascii="Courier New" w:hAnsi="Courier New" w:cs="Courier New"/>
+          <w:sz w:val="22"/>
+          <w:szCs w:val="22"/>
+        </w:rPr>
+        <w:t>atieken</w:t>
+      </w:r>
+      <w:r>
+        <w:rPr>
+          <w:rFonts w:ascii="Courier New" w:hAnsi="Courier New" w:cs="Courier New"/>
+          <w:sz w:val="22"/>
+          <w:szCs w:val="22"/>
+        </w:rPr>
+        <w:t xml:space="preserve"> rondom oorlog en vrede, klimaat en internationaal recht blijft voor mij onduidelijk. Maar het boek geeft richting</w:t>
+      </w:r>
+      <w:r>
+        <w:rPr>
+          <w:rFonts w:ascii="Courier New" w:hAnsi="Courier New" w:cs="Courier New"/>
+          <w:sz w:val="22"/>
+          <w:szCs w:val="22"/>
+        </w:rPr>
+        <w:t>, wil ons begrip van democratie oprekken</w:t>
+      </w:r>
+      <w:r>
+        <w:rPr>
+          <w:rFonts w:ascii="Courier New" w:hAnsi="Courier New" w:cs="Courier New"/>
+          <w:sz w:val="22"/>
+          <w:szCs w:val="22"/>
+        </w:rPr>
+        <w:t xml:space="preserve"> en is ook nog mooi geschreven. Lezen, zou ik zeggen.   </w:t>
+      </w:r>
     </w:p>
     <w:p>
       <w:pPr>

</xml_diff>